<commit_message>
Fix tracked-changes docs: colors werent rendering, content had drifted
Root cause: pandocs docx writer silently drops raw HTML
<span style=color:...>, so every green addition and red
deletion in the 3 tracked-changes chapters rendered as plain
black text in Word. Converted all three .md files to pandocs
native [text]{custom-style=TrackAdd/TrackDel} span syntax and
patched the reference-doc with real character styles (green,
red+strikethrough) - verified the color survives in the actual
docx XML now.

While investigating, found the tracked copies had also drifted
from their current final chapters: Ch1 was missing a citation,
Ch2 had two swapped reference numbers, and Ch3s tracked copy
predated the material-properties table, the gamma/percolation
sentence, and all 5 embedded figures (still showed placeholders).
Resynced all three to match the current chapter text.
</commit_message>
<xml_diff>
--- a/claude/thesis_chapter/CHAPTER1_framework_FA_R1_tracked.docx
+++ b/claude/thesis_chapter/CHAPTER1_framework_FA_R1_tracked.docx
@@ -35,6 +35,7 @@
       </w:r>
       <w:r>
         <w:rPr>
+          <w:rStyle w:val="TrackAdd"/>
           <w:rtl/>
         </w:rPr>
         <w:t xml:space="preserve">سبزرنگ</w:t>
@@ -59,7 +60,7 @@
       </w:r>
       <w:r>
         <w:rPr>
-          <w:strike/>
+          <w:rStyle w:val="TrackDel"/>
           <w:rtl/>
         </w:rPr>
         <w:t xml:space="preserve">قرمز خط‌خورده</w:t>
@@ -121,7 +122,7 @@
       </w:r>
       <w:r>
         <w:rPr>
-          <w:strike/>
+          <w:rStyle w:val="TrackDel"/>
           <w:rtl/>
         </w:rPr>
         <w:t xml:space="preserve">جزعی از سازه ویا</w:t>
@@ -134,6 +135,7 @@
       </w:r>
       <w:r>
         <w:rPr>
+          <w:rStyle w:val="TrackAdd"/>
           <w:rtl/>
         </w:rPr>
         <w:t xml:space="preserve">جزئی از یک سازه و یا</w:t>
@@ -152,6 +154,7 @@
       </w:r>
       <w:r>
         <w:rPr>
+          <w:rStyle w:val="TrackAdd"/>
           <w:rtl/>
         </w:rPr>
         <w:t xml:space="preserve">ٔ مستقل</w:t>
@@ -172,22 +175,11 @@
         <w:rPr>
           <w:rtl/>
         </w:rPr>
-        <w:t xml:space="preserve"> </w:t>
-      </w:r>
-      <w:r>
-        <w:rPr>
-          <w:rtl/>
-        </w:rPr>
         <w:t xml:space="preserve">انتقال سیال، فضاپیماها، رآکتورهای</w:t>
       </w:r>
       <w:r>
         <w:rPr>
-          <w:rtl/>
-        </w:rPr>
-        <w:t xml:space="preserve"> </w:t>
-      </w:r>
-      <w:r>
-        <w:rPr>
+          <w:rStyle w:val="TrackAdd"/>
           <w:rtl/>
         </w:rPr>
         <w:t xml:space="preserve">هسته‌ای</w:t>
@@ -212,13 +204,14 @@
       </w:r>
       <w:r>
         <w:rPr>
-          <w:strike/>
+          <w:rStyle w:val="TrackDel"/>
           <w:rtl/>
         </w:rPr>
         <w:t xml:space="preserve">غیره از آن استفاده می‌شود</w:t>
       </w:r>
       <w:r>
         <w:rPr>
+          <w:rStyle w:val="TrackAdd"/>
           <w:rtl/>
         </w:rPr>
         <w:t xml:space="preserve">مانند آن‌ها به‌کار می‌رود</w:t>
@@ -237,13 +230,14 @@
       </w:r>
       <w:r>
         <w:rPr>
-          <w:strike/>
+          <w:rStyle w:val="TrackDel"/>
           <w:rtl/>
         </w:rPr>
         <w:t xml:space="preserve">استفاده</w:t>
       </w:r>
       <w:r>
         <w:rPr>
+          <w:rStyle w:val="TrackAdd"/>
           <w:rtl/>
         </w:rPr>
         <w:t xml:space="preserve">کاربرد</w:t>
@@ -268,6 +262,7 @@
       </w:r>
       <w:r>
         <w:rPr>
+          <w:rStyle w:val="TrackAdd"/>
           <w:rtl/>
         </w:rPr>
         <w:t xml:space="preserve">همواره</w:t>
@@ -276,12 +271,6 @@
         <w:rPr>
           <w:rtl/>
         </w:rPr>
-        <w:t xml:space="preserve"> </w:t>
-      </w:r>
-      <w:r>
-        <w:rPr>
-          <w:rtl/>
-        </w:rPr>
         <w:t xml:space="preserve">مورد توجه و</w:t>
       </w:r>
       <w:r>
@@ -292,7 +281,7 @@
       </w:r>
       <w:r>
         <w:rPr>
-          <w:strike/>
+          <w:rStyle w:val="TrackDel"/>
           <w:rtl/>
         </w:rPr>
         <w:t xml:space="preserve">تحقیق پژوهشگران و</w:t>
@@ -305,6 +294,7 @@
       </w:r>
       <w:r>
         <w:rPr>
+          <w:rStyle w:val="TrackAdd"/>
           <w:rtl/>
         </w:rPr>
         <w:t xml:space="preserve">پژوهش</w:t>
@@ -313,12 +303,6 @@
         <w:rPr>
           <w:rtl/>
         </w:rPr>
-        <w:t xml:space="preserve"> </w:t>
-      </w:r>
-      <w:r>
-        <w:rPr>
-          <w:rtl/>
-        </w:rPr>
         <w:t xml:space="preserve">دانشمندان قرار گرفته‌اند.</w:t>
       </w:r>
     </w:p>
@@ -334,6 +318,7 @@
       </w:r>
       <w:r>
         <w:rPr>
+          <w:rStyle w:val="TrackAdd"/>
           <w:rtl/>
         </w:rPr>
         <w:t xml:space="preserve">،</w:t>
@@ -352,6 +337,7 @@
       </w:r>
       <w:r>
         <w:rPr>
+          <w:rStyle w:val="TrackAdd"/>
           <w:rtl/>
         </w:rPr>
         <w:t xml:space="preserve">ش</w:t>
@@ -364,12 +350,7 @@
       </w:r>
       <w:r>
         <w:rPr>
-          <w:rtl/>
-        </w:rPr>
-        <w:t xml:space="preserve"> </w:t>
-      </w:r>
-      <w:r>
-        <w:rPr>
+          <w:rStyle w:val="TrackAdd"/>
           <w:rtl/>
         </w:rPr>
         <w:t xml:space="preserve">و</w:t>
@@ -388,6 +369,7 @@
       </w:r>
       <w:r>
         <w:rPr>
+          <w:rStyle w:val="TrackAdd"/>
           <w:rtl/>
         </w:rPr>
         <w:t xml:space="preserve">،</w:t>
@@ -402,49 +384,14 @@
         <w:rPr>
           <w:rtl/>
         </w:rPr>
-        <w:t xml:space="preserve">توجه زیادی را به خود جلب کردند. گرافن</w:t>
-      </w:r>
-      <w:r>
-        <w:rPr>
-          <w:rtl/>
-        </w:rPr>
-        <w:t xml:space="preserve">،</w:t>
-      </w:r>
-      <w:r>
-        <w:rPr>
-          <w:rtl/>
-        </w:rPr>
-        <w:t xml:space="preserve"> </w:t>
-      </w:r>
-      <w:r>
-        <w:rPr>
-          <w:rtl/>
-        </w:rPr>
-        <w:t xml:space="preserve">که یک صفحهٔ تک‌اتمی با آرایش لانه‌زنبوری از اتم‌های کربن با مدول الاستیک فوق‌العاده زیاد، استحکام کششی</w:t>
-      </w:r>
-      <w:r>
-        <w:rPr>
-          <w:rtl/>
-        </w:rPr>
-        <w:t xml:space="preserve"> </w:t>
-      </w:r>
-      <w:r>
-        <w:rPr>
-          <w:rtl/>
-        </w:rPr>
-        <w:t xml:space="preserve">بالا</w:t>
-      </w:r>
-      <w:r>
-        <w:rPr>
-          <w:rtl/>
-        </w:rPr>
-        <w:t xml:space="preserve"> </w:t>
-      </w:r>
-      <w:r>
-        <w:rPr>
-          <w:rtl/>
-        </w:rPr>
-        <w:t xml:space="preserve">و سطح ویژهٔ بسیار بزرگ است، توجه فراوانی را در میان پژوهشگران و صنعتگران برانگیخته است. از زمان کشف گرافن در سال ۲۰۰۴، در بسیاری از مطالعات تجربی گزارش شده است که نانوکامپوزیت‌های تقویت‌شده با گرافن، در مقایسه با کامپوزیت‌های نانولولهٔ کربنی و نانوگرافیت، بهبود قابل‌توجهی در خواص مکانیکی نشان می‌دهند [</w:t>
+        <w:t xml:space="preserve">توجه زیادی را به خود جلب کردند</w:t>
+      </w:r>
+      <w:r>
+        <w:rPr>
+          <w:rStyle w:val="TrackAdd"/>
+          <w:rtl/>
+        </w:rPr>
+        <w:t xml:space="preserve">[</w:t>
       </w:r>
       <w:hyperlink w:anchor="Xc1d5c3a48988e3f28b06b0c8cea541618683479">
         <w:r>
@@ -457,12 +404,79 @@
       </w:hyperlink>
       <w:r>
         <w:rPr>
+          <w:rStyle w:val="TrackAdd"/>
+          <w:rtl/>
+        </w:rPr>
+        <w:t xml:space="preserve">]</w:t>
+      </w:r>
+      <w:r>
+        <w:rPr>
+          <w:rtl/>
+        </w:rPr>
+        <w:t xml:space="preserve">. گرافن</w:t>
+      </w:r>
+      <w:r>
+        <w:rPr>
+          <w:rStyle w:val="TrackAdd"/>
+          <w:rtl/>
+        </w:rPr>
+        <w:t xml:space="preserve">،</w:t>
+      </w:r>
+      <w:r>
+        <w:rPr>
+          <w:rtl/>
+        </w:rPr>
+        <w:t xml:space="preserve"> </w:t>
+      </w:r>
+      <w:r>
+        <w:rPr>
+          <w:rtl/>
+        </w:rPr>
+        <w:t xml:space="preserve">که یک صفحهٔ تک‌اتمی با آرایش لانه‌زنبوری از اتم‌های کربن با مدول الاستیک فوق‌العاده زیاد، استحکام کششی</w:t>
+      </w:r>
+      <w:r>
+        <w:rPr>
+          <w:rtl/>
+        </w:rPr>
+        <w:t xml:space="preserve"> </w:t>
+      </w:r>
+      <w:r>
+        <w:rPr>
+          <w:rStyle w:val="TrackAdd"/>
+          <w:rtl/>
+        </w:rPr>
+        <w:t xml:space="preserve">بالا</w:t>
+      </w:r>
+      <w:r>
+        <w:rPr>
+          <w:rtl/>
+        </w:rPr>
+        <w:t xml:space="preserve"> </w:t>
+      </w:r>
+      <w:r>
+        <w:rPr>
+          <w:rtl/>
+        </w:rPr>
+        <w:t xml:space="preserve">و سطح ویژهٔ بسیار بزرگ است، توجه فراوانی را در میان پژوهشگران و صنعتگران برانگیخته است. از زمان کشف گرافن در سال ۲۰۰۴، در بسیاری از مطالعات تجربی گزارش شده است که نانوکامپوزیت‌های تقویت‌شده با گرافن، در مقایسه با کامپوزیت‌های نانولولهٔ کربنی و نانوگرافیت، بهبود قابل‌توجهی در خواص مکانیکی نشان می‌دهند [</w:t>
+      </w:r>
+      <w:hyperlink w:anchor="Xc1d5c3a48988e3f28b06b0c8cea541618683479">
+        <w:r>
+          <w:rPr>
+            <w:rStyle w:val="Hyperlink"/>
+            <w:rtl/>
+          </w:rPr>
+          <w:t xml:space="preserve">1</w:t>
+        </w:r>
+      </w:hyperlink>
+      <w:r>
+        <w:rPr>
           <w:rtl/>
         </w:rPr>
         <w:t xml:space="preserve">]. همچنین سطح تماس زیاد ورقه‌های گرافن با مادهٔ زمینه</w:t>
       </w:r>
       <w:r>
         <w:rPr>
+          <w:rStyle w:val="TrackAdd"/>
           <w:rtl/>
         </w:rPr>
         <w:t xml:space="preserve">،</w:t>
@@ -574,12 +588,7 @@
       </w:r>
       <w:r>
         <w:rPr>
-          <w:rtl/>
-        </w:rPr>
-        <w:t xml:space="preserve"> </w:t>
-      </w:r>
-      <w:r>
-        <w:rPr>
+          <w:rStyle w:val="TrackDel"/>
           <w:rtl/>
         </w:rPr>
         <w:t xml:space="preserve">و همچنین بازدهی بیشتری نیز دارد</w:t>
@@ -603,12 +612,7 @@
       </w:r>
       <w:r>
         <w:rPr>
-          <w:rtl/>
-        </w:rPr>
-        <w:t xml:space="preserve"> </w:t>
-      </w:r>
-      <w:r>
-        <w:rPr>
+          <w:rStyle w:val="TrackAdd"/>
           <w:rtl/>
         </w:rPr>
         <w:t xml:space="preserve">لایه‌ای</w:t>
@@ -646,7 +650,7 @@
       </w:pPr>
       <w:r>
         <w:rPr>
-          <w:strike/>
+          <w:rStyle w:val="TrackDel"/>
           <w:rtl/>
         </w:rPr>
         <w:t xml:space="preserve">در این قسمت مختصری از نظرات و پژوهش‏های مربوط به موضوع یا مسایل و مشکلات حل نشده در این حوزه و همچنین توجه و علاقه جامعه به این موضوع اشاره می‏شود.</w:t>
@@ -658,6 +662,7 @@
       </w:pPr>
       <w:r>
         <w:rPr>
+          <w:rStyle w:val="TrackAdd"/>
           <w:rtl/>
         </w:rPr>
         <w:t xml:space="preserve">نخستین چارچوب نظریِ کوپلینگِ میدان دما و میدان تغییرشکل، ترموالاستیسیتهٔ کلاسیکِ ممزوج بود که در آن معادلهٔ هدایت گرمای فوریه با معادلات کشسانی جفت می‌شود. با وجود کامیابیِ گستردهٔ این چارچوب در تحلیل تنش‌های حرارتیِ حالت‌ماندگار و گذرایِ آرام، یک نقص بنیادی در آن آشکار شد: معادلهٔ هدایت فوریه از نوع سهموی (پارابولیک) است و از آن سرعت انتشار نامحدود برای اغتشاش حرارتی نتیجه می‌شود؛ یعنی هر تغییر دما در یک نقطه، بی‌درنگ در سراسر جسم احساس می‌گردد. این ویژگی به‌ویژه در بارگذاری‌های حرارتیِ بسیار سریع، مانند شوک حرارتی، پالس لیزری و بارهای انفجاری، با واقعیت فیزیکیِ انتشارِ متناهیِ گرما ناسازگار است [</w:t>
@@ -673,6 +678,7 @@
       </w:hyperlink>
       <w:r>
         <w:rPr>
+          <w:rStyle w:val="TrackAdd"/>
           <w:rtl/>
         </w:rPr>
         <w:t xml:space="preserve">].</w:t>
@@ -684,6 +690,7 @@
       </w:pPr>
       <w:r>
         <w:rPr>
+          <w:rStyle w:val="TrackAdd"/>
           <w:rtl/>
         </w:rPr>
         <w:t xml:space="preserve">برای برطرف‌کردن این ناسازگاری، نظریه‌های ترموالاستیسیتهٔ تعمیم‌یافته پیشنهاد شدند که در آن‌ها معادلهٔ هدایت به یک معادلهٔ هذلولوی (هایپربولیک) با سرعتِ موج حرارتیِ متناهی تبدیل می‌شود؛ پدیده‌ای که به «صوت دوم» شناخته می‌شود. نخستین و شناخته‌شده‌ترینِ این نظریه‌ها را لرد و شولمن در سال ۱۹۶۷ ارائه کردند [</w:t>
@@ -699,12 +706,14 @@
       </w:hyperlink>
       <w:r>
         <w:rPr>
+          <w:rStyle w:val="TrackAdd"/>
           <w:rtl/>
         </w:rPr>
         <w:t xml:space="preserve">]. آنان با افزودن یک زمان تخفیفِ واحد</w:t>
       </w:r>
       <w:r>
         <w:rPr>
+          <w:rStyle w:val="TrackAdd"/>
           <w:rtl/>
         </w:rPr>
         <w:t xml:space="preserve"> </w:t>
@@ -725,18 +734,21 @@
       </m:oMath>
       <w:r>
         <w:rPr>
-          <w:rtl/>
-        </w:rPr>
-        <w:t xml:space="preserve"> </w:t>
-      </w:r>
-      <w:r>
-        <w:rPr>
+          <w:rStyle w:val="TrackAdd"/>
+          <w:rtl/>
+        </w:rPr>
+        <w:t xml:space="preserve"> </w:t>
+      </w:r>
+      <w:r>
+        <w:rPr>
+          <w:rStyle w:val="TrackAdd"/>
           <w:rtl/>
         </w:rPr>
         <w:t xml:space="preserve">به شارِ گرما (بر پایهٔ قانون هدایتِ کاتانئو–ورنوت)، هدایت را هذلولوی ساختند؛ به‌گونه‌ای که با میل‌کردن</w:t>
       </w:r>
       <w:r>
         <w:rPr>
+          <w:rStyle w:val="TrackAdd"/>
           <w:rtl/>
         </w:rPr>
         <w:t xml:space="preserve"> </w:t>
@@ -757,12 +769,14 @@
       </m:oMath>
       <w:r>
         <w:rPr>
-          <w:rtl/>
-        </w:rPr>
-        <w:t xml:space="preserve"> </w:t>
-      </w:r>
-      <w:r>
-        <w:rPr>
+          <w:rStyle w:val="TrackAdd"/>
+          <w:rtl/>
+        </w:rPr>
+        <w:t xml:space="preserve"> </w:t>
+      </w:r>
+      <w:r>
+        <w:rPr>
+          <w:rStyle w:val="TrackAdd"/>
           <w:rtl/>
         </w:rPr>
         <w:t xml:space="preserve">به صفر، مدل کلاسیکِ فوریه بازیابی می‌شود. پس از آن، نظریه‌های دیگری همچون گرین–لیندسی (با دو زمان تخفیف) و گرین–نقدی (بر پایهٔ گرادیان دما و نرخ آن، از نوع بدونِ اتلاف انرژی و با اتلاف) و نیز مدل تأخیر دوفازی معرفی شدند؛ مروری جامع بر این نظریه‌ها و مدل‌های اصلاح‌شده را می‌توان یافت [</w:t>
@@ -778,6 +792,7 @@
       </w:hyperlink>
       <w:r>
         <w:rPr>
+          <w:rStyle w:val="TrackAdd"/>
           <w:rtl/>
         </w:rPr>
         <w:t xml:space="preserve">]. در میان این نظریه‌ها، تئوری لرد–شولمن به‌سبب سادگیِ نسبی (تنها یک زمان تخفیف) و سازگاریِ ترمودینامیکی، بیش از دیگر مدل‌ها در تحلیل سازه‌های تحت شوک حرارتی به‌کار رفته است.</w:t>
@@ -789,6 +804,7 @@
       </w:pPr>
       <w:r>
         <w:rPr>
+          <w:rStyle w:val="TrackAdd"/>
           <w:rtl/>
         </w:rPr>
         <w:t xml:space="preserve">هم‌زمان با پیشرفت این نظریه‌ها، تحلیل استوانه‌ها و کره‌های جدارضخیم تحت بارهای حرارتی و مکانیکی نیز به یکی از حوزه‌های پرکاربردِ پژوهش بدل شد. باگری و اسلامی حلی یکپارچه برای ترموالاستیسیتهٔ تعمیم‌یافتهٔ استوانه‌ها و کره‌ها ارائه کردند [</w:t>
@@ -804,6 +820,7 @@
       </w:hyperlink>
       <w:r>
         <w:rPr>
+          <w:rStyle w:val="TrackAdd"/>
           <w:rtl/>
         </w:rPr>
         <w:t xml:space="preserve">]، و مطالعاتِ متعددی پاسخ استوانه‌های مدرج تابعی را تحت بارگذاری ترمومکانیکی بررسی کردند. با پیدایش کامپوزیت‌های تقویت‌شده با پلاکت‌های گرافنی و مواد مرکب متخلخل، توجه پژوهش‌ها به سازه‌های نوینی معطوف شد که در آن‌ها خواص مؤثر در راستای ضخامت به‌صورت هدفمند مدرج می‌شود؛ حیدرپور و همکاران تحلیل ترموالاستیک پوسته‌های کروی و استوانه‌ایِ تقویت‌شده با گرافن را بر پایهٔ تئوری لرد–شولمن و به روش دیفرانسیل کوادریچر توسعه دادند [</w:t>
@@ -819,12 +836,14 @@
       </w:hyperlink>
       <w:r>
         <w:rPr>
+          <w:rStyle w:val="TrackAdd"/>
           <w:rtl/>
         </w:rPr>
         <w:t xml:space="preserve">,</w:t>
       </w:r>
       <w:r>
         <w:rPr>
+          <w:rStyle w:val="TrackAdd"/>
           <w:rtl/>
         </w:rPr>
         <w:t xml:space="preserve"> </w:t>
@@ -840,12 +859,14 @@
       </w:hyperlink>
       <w:r>
         <w:rPr>
+          <w:rStyle w:val="TrackAdd"/>
           <w:rtl/>
         </w:rPr>
         <w:t xml:space="preserve">]. باوجود این پیشینهٔ غنی، حل کاملاً ممزوجِ لرد–شولمن برای یک استوانهٔ توخالیِ چندلایهٔ متخلخل و تقویت‌شده با گرافن، با در نظر گرفتنِ برهم‌کنشِ کاملِ الگوهای توزیع گرافن و تخلخل در فضای دوبعدیِ</w:t>
       </w:r>
       <w:r>
         <w:rPr>
+          <w:rStyle w:val="TrackAdd"/>
           <w:rtl/>
         </w:rPr>
         <w:t xml:space="preserve"> </w:t>
@@ -878,6 +899,7 @@
       </m:oMath>
       <w:r>
         <w:rPr>
+          <w:rStyle w:val="TrackAdd"/>
           <w:rtl/>
         </w:rPr>
         <w:t xml:space="preserve">، هنوز به‌طور کامل بررسی نشده بود؛ همین شکاف، انگیزهٔ اصلی پژوهش حاضر است.</w:t>
@@ -915,13 +937,14 @@
       </w:r>
       <w:r>
         <w:rPr>
-          <w:strike/>
+          <w:rStyle w:val="TrackDel"/>
           <w:rtl/>
         </w:rPr>
         <w:t xml:space="preserve">خواهد شد</w:t>
       </w:r>
       <w:r>
         <w:rPr>
+          <w:rStyle w:val="TrackAdd"/>
           <w:rtl/>
         </w:rPr>
         <w:t xml:space="preserve">می‌شود</w:t>
@@ -940,12 +963,14 @@
       </w:r>
       <w:r>
         <w:rPr>
+          <w:rStyle w:val="TrackAdd"/>
           <w:rtl/>
         </w:rPr>
         <w:t xml:space="preserve">هندسهٔ مورد بررسی یک استوانهٔ توخالیِ جدارضخیمِ چندلایه با شعاع داخلی</w:t>
       </w:r>
       <w:r>
         <w:rPr>
+          <w:rStyle w:val="TrackAdd"/>
           <w:rtl/>
         </w:rPr>
         <w:t xml:space="preserve"> </w:t>
@@ -984,18 +1009,21 @@
       </m:oMath>
       <w:r>
         <w:rPr>
-          <w:rtl/>
-        </w:rPr>
-        <w:t xml:space="preserve"> </w:t>
-      </w:r>
-      <w:r>
-        <w:rPr>
+          <w:rStyle w:val="TrackAdd"/>
+          <w:rtl/>
+        </w:rPr>
+        <w:t xml:space="preserve"> </w:t>
+      </w:r>
+      <w:r>
+        <w:rPr>
+          <w:rStyle w:val="TrackAdd"/>
           <w:rtl/>
         </w:rPr>
         <w:t xml:space="preserve">متر، شعاع خارجی</w:t>
       </w:r>
       <w:r>
         <w:rPr>
+          <w:rStyle w:val="TrackAdd"/>
           <w:rtl/>
         </w:rPr>
         <w:t xml:space="preserve"> </w:t>
@@ -1034,18 +1062,21 @@
       </m:oMath>
       <w:r>
         <w:rPr>
-          <w:rtl/>
-        </w:rPr>
-        <w:t xml:space="preserve"> </w:t>
-      </w:r>
-      <w:r>
-        <w:rPr>
+          <w:rStyle w:val="TrackAdd"/>
+          <w:rtl/>
+        </w:rPr>
+        <w:t xml:space="preserve"> </w:t>
+      </w:r>
+      <w:r>
+        <w:rPr>
+          <w:rStyle w:val="TrackAdd"/>
           <w:rtl/>
         </w:rPr>
         <w:t xml:space="preserve">متر (ضخامت جداره</w:t>
       </w:r>
       <w:r>
         <w:rPr>
+          <w:rStyle w:val="TrackAdd"/>
           <w:rtl/>
         </w:rPr>
         <w:t xml:space="preserve"> </w:t>
@@ -1111,18 +1142,21 @@
       </m:oMath>
       <w:r>
         <w:rPr>
-          <w:rtl/>
-        </w:rPr>
-        <w:t xml:space="preserve"> </w:t>
-      </w:r>
-      <w:r>
-        <w:rPr>
+          <w:rStyle w:val="TrackAdd"/>
+          <w:rtl/>
+        </w:rPr>
+        <w:t xml:space="preserve"> </w:t>
+      </w:r>
+      <w:r>
+        <w:rPr>
+          <w:rStyle w:val="TrackAdd"/>
           <w:rtl/>
         </w:rPr>
         <w:t xml:space="preserve">متر)، طول</w:t>
       </w:r>
       <w:r>
         <w:rPr>
+          <w:rStyle w:val="TrackAdd"/>
           <w:rtl/>
         </w:rPr>
         <w:t xml:space="preserve"> </w:t>
@@ -1152,18 +1186,21 @@
       </m:oMath>
       <w:r>
         <w:rPr>
-          <w:rtl/>
-        </w:rPr>
-        <w:t xml:space="preserve"> </w:t>
-      </w:r>
-      <w:r>
-        <w:rPr>
+          <w:rStyle w:val="TrackAdd"/>
+          <w:rtl/>
+        </w:rPr>
+        <w:t xml:space="preserve"> </w:t>
+      </w:r>
+      <w:r>
+        <w:rPr>
+          <w:rStyle w:val="TrackAdd"/>
           <w:rtl/>
         </w:rPr>
         <w:t xml:space="preserve">متر و</w:t>
       </w:r>
       <w:r>
         <w:rPr>
+          <w:rStyle w:val="TrackAdd"/>
           <w:rtl/>
         </w:rPr>
         <w:t xml:space="preserve"> </w:t>
@@ -1193,12 +1230,14 @@
       </m:oMath>
       <w:r>
         <w:rPr>
-          <w:rtl/>
-        </w:rPr>
-        <w:t xml:space="preserve"> </w:t>
-      </w:r>
-      <w:r>
-        <w:rPr>
+          <w:rStyle w:val="TrackAdd"/>
+          <w:rtl/>
+        </w:rPr>
+        <w:t xml:space="preserve"> </w:t>
+      </w:r>
+      <w:r>
+        <w:rPr>
+          <w:rStyle w:val="TrackAdd"/>
           <w:rtl/>
         </w:rPr>
         <w:t xml:space="preserve">لایه است. خواص مادی در راستای ضخامت به‌صورت لایه‌ای مدرج می‌شود؛ به‌گونه‌ای که هم توزیع پلاکت‌های گرافن و هم توزیع تخلخل می‌توانند از پنج الگوی متفاوت پیروی کنند.</w:t>
@@ -1235,6 +1274,7 @@
       </w:pPr>
       <w:r>
         <w:rPr>
+          <w:rStyle w:val="TrackAdd"/>
           <w:rtl/>
         </w:rPr>
         <w:t xml:space="preserve">پرسش‌های اصلی پژوهش عبارت‌اند از:</w:t>
@@ -1251,6 +1291,7 @@
       </w:pPr>
       <w:r>
         <w:rPr>
+          <w:rStyle w:val="TrackAdd"/>
           <w:rtl/>
         </w:rPr>
         <w:t xml:space="preserve">سرعتِ متناهیِ موج حرارتی در تئوری لرد–شولمن چه تفاوتی در پاسخ دما، تنش و جابجایی نسبت به هدایت کلاسیک فوریه ایجاد می‌کند؟</w:t>
@@ -1267,6 +1308,7 @@
       </w:pPr>
       <w:r>
         <w:rPr>
+          <w:rStyle w:val="TrackAdd"/>
           <w:rtl/>
         </w:rPr>
         <w:t xml:space="preserve">الگوی توزیع پلاکت‌های گرافن و الگو و شدت تخلخل، هر یک چگونه بر بیشینهٔ دما، تنش‌های حرارتی و جابجایی‌ها اثر می‌گذارند؟</w:t>
@@ -1283,6 +1325,7 @@
       </w:pPr>
       <w:r>
         <w:rPr>
+          <w:rStyle w:val="TrackAdd"/>
           <w:rtl/>
         </w:rPr>
         <w:t xml:space="preserve">آیا برهم‌کنشِ هم‌زمانِ الگوهای گرافن و تخلخل می‌تواند رفتار هم‌افزا یا خنثی‌کننده پدید آورد و برای حفاظت حرارتی بهینه شود؟</w:t>
@@ -1299,6 +1342,7 @@
       </w:pPr>
       <w:r>
         <w:rPr>
+          <w:rStyle w:val="TrackAdd"/>
           <w:rtl/>
         </w:rPr>
         <w:t xml:space="preserve">تأثیر پارامترهایی همچون کسر وزنی گرافن، نسبت‌های ابعادی پلاکت، زمان تخفیف، شرایط تکیه‌گاهی، فشار داخلی و ضخامت جداره بر پاسخ گذرا چگونه است؟</w:t>
@@ -1347,13 +1391,14 @@
       </w:r>
       <w:r>
         <w:rPr>
-          <w:strike/>
+          <w:rStyle w:val="TrackDel"/>
           <w:rtl/>
         </w:rPr>
         <w:t xml:space="preserve">در پایان نتیجه گیری اعلام می‌شود</w:t>
       </w:r>
       <w:r>
         <w:rPr>
+          <w:rStyle w:val="TrackAdd"/>
           <w:rtl/>
         </w:rPr>
         <w:t xml:space="preserve">نتیجه‌گیری ارائه می‌گردد</w:t>
@@ -1385,7 +1430,7 @@
       </w:pPr>
       <w:r>
         <w:rPr>
-          <w:strike/>
+          <w:rStyle w:val="TrackDel"/>
           <w:rtl/>
         </w:rPr>
         <w:t xml:space="preserve">با توجه به همانندی این قسمت از طرح پژوهش با تعریف موضوع پژوهش که در آن پژوهشگر نیاز خود را در آگاهی به نتایج مطالعه عنوان می‏سازد، در این قسمت منابع شخصی یا علمی که از خاتمه پژوهش به پژوهشگر دست می‏دهد، بحث می‏شود.</w:t>
@@ -1397,6 +1442,7 @@
       </w:pPr>
       <w:r>
         <w:rPr>
+          <w:rStyle w:val="TrackAdd"/>
           <w:rtl/>
         </w:rPr>
         <w:t xml:space="preserve">استوانه‌های جدارضخیم که در مخازن تحت‌فشار، اجزای رآکتورهای هسته‌ای، سازه‌های هوافضایی و مبدل‌های حرارتی به‌کار می‌روند، اغلب در معرض بارهای حرارتیِ سریع و شدید قرار می‌گیرند. در چنین شرایطی، پیش‌بینیِ دقیقِ میدان دما و تنش‌های حرارتیِ گذرا برای تضمینِ ایمنی و طول عمر سازه حیاتی است. تحلیل کلاسیک بر پایهٔ هدایت فوریه، به‌سببِ فرضِ سرعت نامحدودِ انتشار گرما، بیشینهٔ تنش‌های گذرا را در جبهه‌های موجِ حرارتی به‌شکلی نامحافظه‌کارانه کم‌برآورد می‌کند؛ این کم‌برآوردی در بارگذاری‌های ضربه‌ای می‌تواند بسیار بزرگ باشد. از این‌رو به‌کارگیری تئوری لرد–شولمن، که سرعتِ متناهیِ موج حرارتی را لحاظ می‌کند، برای طراحی ایمنِ چنین اجزایی اهمیت مهندسی مستقیم دارد.</w:t>
@@ -1408,6 +1454,7 @@
       </w:pPr>
       <w:r>
         <w:rPr>
+          <w:rStyle w:val="TrackAdd"/>
           <w:rtl/>
         </w:rPr>
         <w:t xml:space="preserve">افزون بر این، ترکیبِ گرافن (به‌عنوان تقویت‌کنندهٔ رسانا و پُراستحکام) با تخلخل (به‌عنوان عاملِ سبک‌سازی و عایق‌سازیِ حرارتی) در یک مادهٔ مدرجِ لایه‌ای، این امکان را فراهم می‌آورد که با هم‌راستا کردنِ الگوهای توزیع، به‌طور هم‌زمان وزن سازه کاهش یابد و مقاومت حرارتی و مکانیکی آن بهبود پذیرد. شناختِ چگونگیِ اثرگذاریِ این الگوها و برهم‌کنشِ آن‌ها، به طراح اجازه می‌دهد توزیعِ ماده را متناسب با شرایط بارگذاری بهینه کند. بدین‌ترتیب، نتایج این پژوهش هم از منظر علمی، در روشن‌ساختنِ سرشتِ موجیِ هدایت گرما در سازه‌های نوین، و هم از منظر کاربردی، در ارائهٔ توصیه‌های طراحی برای حفاظت حرارتی، سودمند است.</w:t>
@@ -1433,7 +1480,7 @@
       </w:pPr>
       <w:r>
         <w:rPr>
-          <w:strike/>
+          <w:rStyle w:val="TrackDel"/>
           <w:rtl/>
         </w:rPr>
         <w:t xml:space="preserve">محدودیت‏هایی که کنترل آن از عهده پژوهشگر خارج است مانند انتخاب نوع یافته‏ها و دیگر محدودیت‏هایی که کنترل آن در دست پژوهشگر است مانند موضوع و محل پژوهش</w:t>
@@ -1445,6 +1492,7 @@
       </w:pPr>
       <w:r>
         <w:rPr>
+          <w:rStyle w:val="TrackAdd"/>
           <w:rtl/>
         </w:rPr>
         <w:t xml:space="preserve">در این پژوهش، برای امکان‌پذیر ساختنِ تحلیل و تمرکز بر پدیده‌های اصلی، فرض‌ها و محدودیت‌های زیر در نظر گرفته شده است:</w:t>
@@ -1461,6 +1509,7 @@
       </w:pPr>
       <w:r>
         <w:rPr>
+          <w:rStyle w:val="TrackAdd"/>
           <w:b/>
           <w:bCs/>
           <w:rtl/>
@@ -1469,12 +1518,14 @@
       </w:r>
       <w:r>
         <w:rPr>
-          <w:rtl/>
-        </w:rPr>
-        <w:t xml:space="preserve"> </w:t>
-      </w:r>
-      <w:r>
-        <w:rPr>
+          <w:rStyle w:val="TrackAdd"/>
+          <w:rtl/>
+        </w:rPr>
+        <w:t xml:space="preserve"> </w:t>
+      </w:r>
+      <w:r>
+        <w:rPr>
+          <w:rStyle w:val="TrackAdd"/>
           <w:rtl/>
         </w:rPr>
         <w:t xml:space="preserve">رفتار ماده کاملاً کشسانِ خطی فرض شده و از مدل‌های آسیب، شکست و پلاستیسیته صرف‌نظر شده است؛ بنابراین حل حاضر پیش‌بینیِ گسست یا جدایشِ ماده را در بارهای بسیار زیاد در بر نمی‌گیرد.</w:t>
@@ -1491,6 +1542,7 @@
       </w:pPr>
       <w:r>
         <w:rPr>
+          <w:rStyle w:val="TrackAdd"/>
           <w:b/>
           <w:bCs/>
           <w:rtl/>
@@ -1499,12 +1551,14 @@
       </w:r>
       <w:r>
         <w:rPr>
-          <w:rtl/>
-        </w:rPr>
-        <w:t xml:space="preserve"> </w:t>
-      </w:r>
-      <w:r>
-        <w:rPr>
+          <w:rStyle w:val="TrackAdd"/>
+          <w:rtl/>
+        </w:rPr>
+        <w:t xml:space="preserve"> </w:t>
+      </w:r>
+      <w:r>
+        <w:rPr>
+          <w:rStyle w:val="TrackAdd"/>
           <w:rtl/>
         </w:rPr>
         <w:t xml:space="preserve">خواص مادی (مدول یانگ، هدایت حرارتی و ضریب انبساط) در بازهٔ دماییِ ۳۰۰ تا ۶۰۰ کلوین ثابت و مستقل از دما فرض شده‌اند، درحالی‌که این خواص در این بازه می‌توانند تغییر کنند.</w:t>
@@ -1521,6 +1575,7 @@
       </w:pPr>
       <w:r>
         <w:rPr>
+          <w:rStyle w:val="TrackAdd"/>
           <w:b/>
           <w:bCs/>
           <w:rtl/>
@@ -1529,12 +1584,14 @@
       </w:r>
       <w:r>
         <w:rPr>
-          <w:rtl/>
-        </w:rPr>
-        <w:t xml:space="preserve"> </w:t>
-      </w:r>
-      <w:r>
-        <w:rPr>
+          <w:rStyle w:val="TrackAdd"/>
+          <w:rtl/>
+        </w:rPr>
+        <w:t xml:space="preserve"> </w:t>
+      </w:r>
+      <w:r>
+        <w:rPr>
+          <w:rStyle w:val="TrackAdd"/>
           <w:rtl/>
         </w:rPr>
         <w:t xml:space="preserve">دو سرِ استوانه عایق حرارتی فرض شده و تبادل حرارت با محیط تنها از راه همرفتِ خطی در سطح خارجی لحاظ شده است؛ از تبادل حرارتِ تابشیِ غیرخطی صرف‌نظر شده است.</w:t>
@@ -1551,6 +1608,7 @@
       </w:pPr>
       <w:r>
         <w:rPr>
+          <w:rStyle w:val="TrackAdd"/>
           <w:b/>
           <w:bCs/>
           <w:rtl/>
@@ -1559,18 +1617,21 @@
       </w:r>
       <w:r>
         <w:rPr>
-          <w:rtl/>
-        </w:rPr>
-        <w:t xml:space="preserve"> </w:t>
-      </w:r>
-      <w:r>
-        <w:rPr>
+          <w:rStyle w:val="TrackAdd"/>
+          <w:rtl/>
+        </w:rPr>
+        <w:t xml:space="preserve"> </w:t>
+      </w:r>
+      <w:r>
+        <w:rPr>
+          <w:rStyle w:val="TrackAdd"/>
           <w:rtl/>
         </w:rPr>
         <w:t xml:space="preserve">مسئله متقارن محوری در نظر گرفته شده و وابستگی میدان‌ها به مختصهٔ محیطی</w:t>
       </w:r>
       <w:r>
         <w:rPr>
+          <w:rStyle w:val="TrackAdd"/>
           <w:rtl/>
         </w:rPr>
         <w:t xml:space="preserve"> </w:t>
@@ -1582,12 +1643,14 @@
       </m:oMath>
       <w:r>
         <w:rPr>
-          <w:rtl/>
-        </w:rPr>
-        <w:t xml:space="preserve"> </w:t>
-      </w:r>
-      <w:r>
-        <w:rPr>
+          <w:rStyle w:val="TrackAdd"/>
+          <w:rtl/>
+        </w:rPr>
+        <w:t xml:space="preserve"> </w:t>
+      </w:r>
+      <w:r>
+        <w:rPr>
+          <w:rStyle w:val="TrackAdd"/>
           <w:rtl/>
         </w:rPr>
         <w:t xml:space="preserve">حذف شده است؛ استوانه ساکن (غیردوّار) فرض می‌شود.</w:t>
@@ -1604,6 +1667,7 @@
       </w:pPr>
       <w:r>
         <w:rPr>
+          <w:rStyle w:val="TrackAdd"/>
           <w:b/>
           <w:bCs/>
           <w:rtl/>
@@ -1612,12 +1676,14 @@
       </w:r>
       <w:r>
         <w:rPr>
-          <w:rtl/>
-        </w:rPr>
-        <w:t xml:space="preserve"> </w:t>
-      </w:r>
-      <w:r>
-        <w:rPr>
+          <w:rStyle w:val="TrackAdd"/>
+          <w:rtl/>
+        </w:rPr>
+        <w:t xml:space="preserve"> </w:t>
+      </w:r>
+      <w:r>
+        <w:rPr>
+          <w:rStyle w:val="TrackAdd"/>
           <w:rtl/>
         </w:rPr>
         <w:t xml:space="preserve">الگوهای توزیع تخلخلِ به‌کاررفته، همان الگوهای پیاده‌سازی‌شده در حل‌گر هستند؛ به‌روزرسانیِ این الگوها با الگوهای جدید و بازاجرای مطالعاتِ مربوط، به پژوهش‌های آینده موکول شده است.</w:t>
@@ -1763,12 +1829,7 @@
       </w:r>
       <w:r>
         <w:rPr>
-          <w:rtl/>
-        </w:rPr>
-        <w:t xml:space="preserve"> </w:t>
-      </w:r>
-      <w:r>
-        <w:rPr>
+          <w:rStyle w:val="TrackAdd"/>
           <w:rtl/>
         </w:rPr>
         <w:t xml:space="preserve">و در آن با معرفیِ زمان تخفیف، سرعتِ انتشار موج حرارتی متناهی می‌شود</w:t>
@@ -1799,7 +1860,7 @@
       </w:pPr>
       <w:r>
         <w:rPr>
-          <w:strike/>
+          <w:rStyle w:val="TrackDel"/>
           <w:rtl/>
         </w:rPr>
         <w:t xml:space="preserve">متن عادی پایان‏نامه</w:t>
@@ -1811,6 +1872,7 @@
       </w:pPr>
       <w:r>
         <w:rPr>
+          <w:rStyle w:val="TrackAdd"/>
           <w:rtl/>
         </w:rPr>
         <w:t xml:space="preserve">این پایان‌نامه در پنج فصل سازمان‌دهی شده است:</w:t>
@@ -1827,6 +1889,7 @@
       </w:pPr>
       <w:r>
         <w:rPr>
+          <w:rStyle w:val="TrackAdd"/>
           <w:b/>
           <w:bCs/>
           <w:rtl/>
@@ -1835,12 +1898,14 @@
       </w:r>
       <w:r>
         <w:rPr>
-          <w:rtl/>
-        </w:rPr>
-        <w:t xml:space="preserve"> </w:t>
-      </w:r>
-      <w:r>
-        <w:rPr>
+          <w:rStyle w:val="TrackAdd"/>
+          <w:rtl/>
+        </w:rPr>
+        <w:t xml:space="preserve"> </w:t>
+      </w:r>
+      <w:r>
+        <w:rPr>
+          <w:rStyle w:val="TrackAdd"/>
           <w:rtl/>
         </w:rPr>
         <w:t xml:space="preserve">بیان مسئله و اهمیت مهندسیِ آن، انگیزه و کاربردهای واقعی، ضرورتِ به‌کارگیریِ تئوری لرد–شولمن به‌جای هدایت کلاسیک فوریه، هدف‌ها و پرسش‌های پژوهش، دامنه و فرض‌ها، و ساختار پایان‌نامه معرفی می‌شوند.</w:t>
@@ -1857,6 +1922,7 @@
       </w:pPr>
       <w:r>
         <w:rPr>
+          <w:rStyle w:val="TrackAdd"/>
           <w:b/>
           <w:bCs/>
           <w:rtl/>
@@ -1865,12 +1931,14 @@
       </w:r>
       <w:r>
         <w:rPr>
-          <w:rtl/>
-        </w:rPr>
-        <w:t xml:space="preserve"> </w:t>
-      </w:r>
-      <w:r>
-        <w:rPr>
+          <w:rStyle w:val="TrackAdd"/>
+          <w:rtl/>
+        </w:rPr>
+        <w:t xml:space="preserve"> </w:t>
+      </w:r>
+      <w:r>
+        <w:rPr>
+          <w:rStyle w:val="TrackAdd"/>
           <w:rtl/>
         </w:rPr>
         <w:t xml:space="preserve">مروری نظام‌مند بر ادبیات موضوع ارائه می‌شود؛ شامل تئوری‌های به‌کاررفته در تحلیل استوانه‌ها، پژوهش‌های مربوط به استوانه‌ها، مخروط‌ها، کره‌ها و دیسک‌های کامپوزیتی، استوانه‌ها تحت بار ترمو-مکانیکی، مواد مرکب متخلخل، و تئوری‌های ترموالاستیکِ تعمیم‌یافته و ممزوج؛ و در پایان، شکاف پژوهشی که این پایان‌نامه به آن می‌پردازد مشخص می‌شود.</w:t>
@@ -1887,6 +1955,7 @@
       </w:pPr>
       <w:r>
         <w:rPr>
+          <w:rStyle w:val="TrackAdd"/>
           <w:b/>
           <w:bCs/>
           <w:rtl/>
@@ -1895,12 +1964,14 @@
       </w:r>
       <w:r>
         <w:rPr>
-          <w:rtl/>
-        </w:rPr>
-        <w:t xml:space="preserve"> </w:t>
-      </w:r>
-      <w:r>
-        <w:rPr>
+          <w:rStyle w:val="TrackAdd"/>
+          <w:rtl/>
+        </w:rPr>
+        <w:t xml:space="preserve"> </w:t>
+      </w:r>
+      <w:r>
+        <w:rPr>
+          <w:rStyle w:val="TrackAdd"/>
           <w:rtl/>
         </w:rPr>
         <w:t xml:space="preserve">خواص مؤثر مادهٔ تقویت‌شده با گرافن و متخلخل (به روش هالپین–تسای، قانون مخلوط‌ها و تئوری سلول‌های باز) و الگوهای توزیع گرافن و تخلخل استخراج می‌شوند؛ سپس روابط کرنش-جابجایی، تنش-کرنش، معادلات حرکت و معادلهٔ بقای انرژی لرد–شولمن، به‌همراه شرایط مرزی، اولیه و سازگاریِ مکانیکی و حرارتی به‌دست می‌آیند. در ادامه، گسسته‌سازی به روش دیفرانسیل کوادریچر و حلِ سیستمِ مونتاژشده به روش نیومارک تشریح می‌شود.</w:t>
@@ -1917,6 +1988,7 @@
       </w:pPr>
       <w:r>
         <w:rPr>
+          <w:rStyle w:val="TrackAdd"/>
           <w:b/>
           <w:bCs/>
           <w:rtl/>
@@ -1925,12 +1997,14 @@
       </w:r>
       <w:r>
         <w:rPr>
-          <w:rtl/>
-        </w:rPr>
-        <w:t xml:space="preserve"> </w:t>
-      </w:r>
-      <w:r>
-        <w:rPr>
+          <w:rStyle w:val="TrackAdd"/>
+          <w:rtl/>
+        </w:rPr>
+        <w:t xml:space="preserve"> </w:t>
+      </w:r>
+      <w:r>
+        <w:rPr>
+          <w:rStyle w:val="TrackAdd"/>
           <w:rtl/>
         </w:rPr>
         <w:t xml:space="preserve">پس از معرفیِ مسئلهٔ مرجع و کمیت‌های بی‌بعد، همگرایی و صحت‌سنجیِ حل‌گر اثبات می‌شود؛ سپس مطالعات پارامتریِ گسترده (الگوی گرافن و تخلخل، کسر وزنی، نسبت‌های ابعادی، زمان تخفیف، شرایط تکیه‌گاهی، فشار، طول و ضخامت جداره، ممزوج‌بودن معادلات و شوک حرارتی گاوسی) و سه مطالعهٔ گسترشیِ روش‌شناختی گزارش می‌شوند.</w:t>
@@ -1947,6 +2021,7 @@
       </w:pPr>
       <w:r>
         <w:rPr>
+          <w:rStyle w:val="TrackAdd"/>
           <w:b/>
           <w:bCs/>
           <w:rtl/>
@@ -1955,12 +2030,14 @@
       </w:r>
       <w:r>
         <w:rPr>
-          <w:rtl/>
-        </w:rPr>
-        <w:t xml:space="preserve"> </w:t>
-      </w:r>
-      <w:r>
-        <w:rPr>
+          <w:rStyle w:val="TrackAdd"/>
+          <w:rtl/>
+        </w:rPr>
+        <w:t xml:space="preserve"> </w:t>
+      </w:r>
+      <w:r>
+        <w:rPr>
+          <w:rStyle w:val="TrackAdd"/>
           <w:rtl/>
         </w:rPr>
         <w:t xml:space="preserve">مهم‌ترین یافته‌ها، نوآوری‌ها، محدودیت‌ها و پیشنهادها برای پژوهش‌های آینده جمع‌بندی می‌شوند.</w:t>
@@ -1972,7 +2049,7 @@
       </w:pPr>
       <w:r>
         <w:rPr>
-          <w:strike/>
+          <w:rStyle w:val="TrackDel"/>
           <w:rtl/>
         </w:rPr>
         <w:t xml:space="preserve">### عنوان بخش سوم</w:t>
@@ -1984,7 +2061,7 @@
       </w:pPr>
       <w:r>
         <w:rPr>
-          <w:strike/>
+          <w:rStyle w:val="TrackDel"/>
           <w:rtl/>
         </w:rPr>
         <w:t xml:space="preserve">متن عادی پایان‏نامه</w:t>
@@ -2989,7 +3066,22 @@
       <w:color w:themeColor="accent1" w:themeShade="BF" w:val="365F91"/>
     </w:rPr>
   </w:style>
-  <w:style w:type="paragraph" w:customStyle="1" w:styleId="SourceCode">
+  <w:style w:customStyle="1" w:styleId="TrackAdd" w:type="character">
+    <w:name w:val="TrackAdd"/>
+    <w:basedOn w:val="BodyTextChar"/>
+    <w:rPr>
+      <w:color w:val="137333"/>
+    </w:rPr>
+  </w:style>
+  <w:style w:customStyle="1" w:styleId="TrackDel" w:type="character">
+    <w:name w:val="TrackDel"/>
+    <w:basedOn w:val="BodyTextChar"/>
+    <w:rPr>
+      <w:color w:val="C5221F"/>
+      <w:strike/>
+    </w:rPr>
+  </w:style>
+  <w:style w:customStyle="1" w:styleId="SourceCode" w:type="paragraph">
     <w:name w:val="Source Code"/>
     <w:basedOn w:val="Normal"/>
     <w:link w:val="VerbatimChar"/>
@@ -2997,7 +3089,7 @@
       <w:wordWrap w:val="off"/>
     </w:pPr>
   </w:style>
-  <w:style w:type="character" w:customStyle="1" w:styleId="KeywordTok">
+  <w:style w:customStyle="1" w:styleId="KeywordTok" w:type="character">
     <w:name w:val="KeywordTok"/>
     <w:basedOn w:val="VerbatimChar"/>
     <w:rPr>
@@ -3005,77 +3097,77 @@
       <w:color w:val="007020"/>
     </w:rPr>
   </w:style>
-  <w:style w:type="character" w:customStyle="1" w:styleId="DataTypeTok">
+  <w:style w:customStyle="1" w:styleId="DataTypeTok" w:type="character">
     <w:name w:val="DataTypeTok"/>
     <w:basedOn w:val="VerbatimChar"/>
     <w:rPr>
       <w:color w:val="902000"/>
     </w:rPr>
   </w:style>
-  <w:style w:type="character" w:customStyle="1" w:styleId="DecValTok">
+  <w:style w:customStyle="1" w:styleId="DecValTok" w:type="character">
     <w:name w:val="DecValTok"/>
     <w:basedOn w:val="VerbatimChar"/>
     <w:rPr>
       <w:color w:val="40a070"/>
     </w:rPr>
   </w:style>
-  <w:style w:type="character" w:customStyle="1" w:styleId="BaseNTok">
+  <w:style w:customStyle="1" w:styleId="BaseNTok" w:type="character">
     <w:name w:val="BaseNTok"/>
     <w:basedOn w:val="VerbatimChar"/>
     <w:rPr>
       <w:color w:val="40a070"/>
     </w:rPr>
   </w:style>
-  <w:style w:type="character" w:customStyle="1" w:styleId="FloatTok">
+  <w:style w:customStyle="1" w:styleId="FloatTok" w:type="character">
     <w:name w:val="FloatTok"/>
     <w:basedOn w:val="VerbatimChar"/>
     <w:rPr>
       <w:color w:val="40a070"/>
     </w:rPr>
   </w:style>
-  <w:style w:type="character" w:customStyle="1" w:styleId="ConstantTok">
+  <w:style w:customStyle="1" w:styleId="ConstantTok" w:type="character">
     <w:name w:val="ConstantTok"/>
     <w:basedOn w:val="VerbatimChar"/>
     <w:rPr>
       <w:color w:val="880000"/>
     </w:rPr>
   </w:style>
-  <w:style w:type="character" w:customStyle="1" w:styleId="CharTok">
+  <w:style w:customStyle="1" w:styleId="CharTok" w:type="character">
     <w:name w:val="CharTok"/>
     <w:basedOn w:val="VerbatimChar"/>
     <w:rPr>
       <w:color w:val="4070a0"/>
     </w:rPr>
   </w:style>
-  <w:style w:type="character" w:customStyle="1" w:styleId="SpecialCharTok">
+  <w:style w:customStyle="1" w:styleId="SpecialCharTok" w:type="character">
     <w:name w:val="SpecialCharTok"/>
     <w:basedOn w:val="VerbatimChar"/>
     <w:rPr>
       <w:color w:val="4070a0"/>
     </w:rPr>
   </w:style>
-  <w:style w:type="character" w:customStyle="1" w:styleId="StringTok">
+  <w:style w:customStyle="1" w:styleId="StringTok" w:type="character">
     <w:name w:val="StringTok"/>
     <w:basedOn w:val="VerbatimChar"/>
     <w:rPr>
       <w:color w:val="4070a0"/>
     </w:rPr>
   </w:style>
-  <w:style w:type="character" w:customStyle="1" w:styleId="VerbatimStringTok">
+  <w:style w:customStyle="1" w:styleId="VerbatimStringTok" w:type="character">
     <w:name w:val="VerbatimStringTok"/>
     <w:basedOn w:val="VerbatimChar"/>
     <w:rPr>
       <w:color w:val="4070a0"/>
     </w:rPr>
   </w:style>
-  <w:style w:type="character" w:customStyle="1" w:styleId="SpecialStringTok">
+  <w:style w:customStyle="1" w:styleId="SpecialStringTok" w:type="character">
     <w:name w:val="SpecialStringTok"/>
     <w:basedOn w:val="VerbatimChar"/>
     <w:rPr>
       <w:color w:val="bb6688"/>
     </w:rPr>
   </w:style>
-  <w:style w:type="character" w:customStyle="1" w:styleId="ImportTok">
+  <w:style w:customStyle="1" w:styleId="ImportTok" w:type="character">
     <w:name w:val="ImportTok"/>
     <w:basedOn w:val="VerbatimChar"/>
     <w:rPr>
@@ -3083,7 +3175,7 @@
       <w:color w:val="008000"/>
     </w:rPr>
   </w:style>
-  <w:style w:type="character" w:customStyle="1" w:styleId="CommentTok">
+  <w:style w:customStyle="1" w:styleId="CommentTok" w:type="character">
     <w:name w:val="CommentTok"/>
     <w:basedOn w:val="VerbatimChar"/>
     <w:rPr>
@@ -3091,7 +3183,7 @@
       <w:color w:val="60a0b0"/>
     </w:rPr>
   </w:style>
-  <w:style w:type="character" w:customStyle="1" w:styleId="DocumentationTok">
+  <w:style w:customStyle="1" w:styleId="DocumentationTok" w:type="character">
     <w:name w:val="DocumentationTok"/>
     <w:basedOn w:val="VerbatimChar"/>
     <w:rPr>
@@ -3099,7 +3191,7 @@
       <w:color w:val="ba2121"/>
     </w:rPr>
   </w:style>
-  <w:style w:type="character" w:customStyle="1" w:styleId="AnnotationTok">
+  <w:style w:customStyle="1" w:styleId="AnnotationTok" w:type="character">
     <w:name w:val="AnnotationTok"/>
     <w:basedOn w:val="VerbatimChar"/>
     <w:rPr>
@@ -3108,7 +3200,7 @@
       <w:color w:val="60a0b0"/>
     </w:rPr>
   </w:style>
-  <w:style w:type="character" w:customStyle="1" w:styleId="CommentVarTok">
+  <w:style w:customStyle="1" w:styleId="CommentVarTok" w:type="character">
     <w:name w:val="CommentVarTok"/>
     <w:basedOn w:val="VerbatimChar"/>
     <w:rPr>
@@ -3117,28 +3209,28 @@
       <w:color w:val="60a0b0"/>
     </w:rPr>
   </w:style>
-  <w:style w:type="character" w:customStyle="1" w:styleId="OtherTok">
+  <w:style w:customStyle="1" w:styleId="OtherTok" w:type="character">
     <w:name w:val="OtherTok"/>
     <w:basedOn w:val="VerbatimChar"/>
     <w:rPr>
       <w:color w:val="007020"/>
     </w:rPr>
   </w:style>
-  <w:style w:type="character" w:customStyle="1" w:styleId="FunctionTok">
+  <w:style w:customStyle="1" w:styleId="FunctionTok" w:type="character">
     <w:name w:val="FunctionTok"/>
     <w:basedOn w:val="VerbatimChar"/>
     <w:rPr>
       <w:color w:val="06287e"/>
     </w:rPr>
   </w:style>
-  <w:style w:type="character" w:customStyle="1" w:styleId="VariableTok">
+  <w:style w:customStyle="1" w:styleId="VariableTok" w:type="character">
     <w:name w:val="VariableTok"/>
     <w:basedOn w:val="VerbatimChar"/>
     <w:rPr>
       <w:color w:val="19177c"/>
     </w:rPr>
   </w:style>
-  <w:style w:type="character" w:customStyle="1" w:styleId="ControlFlowTok">
+  <w:style w:customStyle="1" w:styleId="ControlFlowTok" w:type="character">
     <w:name w:val="ControlFlowTok"/>
     <w:basedOn w:val="VerbatimChar"/>
     <w:rPr>
@@ -3146,45 +3238,45 @@
       <w:color w:val="007020"/>
     </w:rPr>
   </w:style>
-  <w:style w:type="character" w:customStyle="1" w:styleId="OperatorTok">
+  <w:style w:customStyle="1" w:styleId="OperatorTok" w:type="character">
     <w:name w:val="OperatorTok"/>
     <w:basedOn w:val="VerbatimChar"/>
     <w:rPr>
       <w:color w:val="666666"/>
     </w:rPr>
   </w:style>
-  <w:style w:type="character" w:customStyle="1" w:styleId="BuiltInTok">
+  <w:style w:customStyle="1" w:styleId="BuiltInTok" w:type="character">
     <w:name w:val="BuiltInTok"/>
     <w:basedOn w:val="VerbatimChar"/>
     <w:rPr>
       <w:color w:val="008000"/>
     </w:rPr>
   </w:style>
-  <w:style w:type="character" w:customStyle="1" w:styleId="ExtensionTok">
+  <w:style w:customStyle="1" w:styleId="ExtensionTok" w:type="character">
     <w:name w:val="ExtensionTok"/>
     <w:basedOn w:val="VerbatimChar"/>
     <w:rPr/>
   </w:style>
-  <w:style w:type="character" w:customStyle="1" w:styleId="PreprocessorTok">
+  <w:style w:customStyle="1" w:styleId="PreprocessorTok" w:type="character">
     <w:name w:val="PreprocessorTok"/>
     <w:basedOn w:val="VerbatimChar"/>
     <w:rPr>
       <w:color w:val="bc7a00"/>
     </w:rPr>
   </w:style>
-  <w:style w:type="character" w:customStyle="1" w:styleId="AttributeTok">
+  <w:style w:customStyle="1" w:styleId="AttributeTok" w:type="character">
     <w:name w:val="AttributeTok"/>
     <w:basedOn w:val="VerbatimChar"/>
     <w:rPr>
       <w:color w:val="7d9029"/>
     </w:rPr>
   </w:style>
-  <w:style w:type="character" w:customStyle="1" w:styleId="RegionMarkerTok">
+  <w:style w:customStyle="1" w:styleId="RegionMarkerTok" w:type="character">
     <w:name w:val="RegionMarkerTok"/>
     <w:basedOn w:val="VerbatimChar"/>
     <w:rPr/>
   </w:style>
-  <w:style w:type="character" w:customStyle="1" w:styleId="InformationTok">
+  <w:style w:customStyle="1" w:styleId="InformationTok" w:type="character">
     <w:name w:val="InformationTok"/>
     <w:basedOn w:val="VerbatimChar"/>
     <w:rPr>
@@ -3193,7 +3285,7 @@
       <w:color w:val="60a0b0"/>
     </w:rPr>
   </w:style>
-  <w:style w:type="character" w:customStyle="1" w:styleId="WarningTok">
+  <w:style w:customStyle="1" w:styleId="WarningTok" w:type="character">
     <w:name w:val="WarningTok"/>
     <w:basedOn w:val="VerbatimChar"/>
     <w:rPr>
@@ -3202,7 +3294,7 @@
       <w:color w:val="60a0b0"/>
     </w:rPr>
   </w:style>
-  <w:style w:type="character" w:customStyle="1" w:styleId="AlertTok">
+  <w:style w:customStyle="1" w:styleId="AlertTok" w:type="character">
     <w:name w:val="AlertTok"/>
     <w:basedOn w:val="VerbatimChar"/>
     <w:rPr>
@@ -3210,7 +3302,7 @@
       <w:color w:val="ff0000"/>
     </w:rPr>
   </w:style>
-  <w:style w:type="character" w:customStyle="1" w:styleId="ErrorTok">
+  <w:style w:customStyle="1" w:styleId="ErrorTok" w:type="character">
     <w:name w:val="ErrorTok"/>
     <w:basedOn w:val="VerbatimChar"/>
     <w:rPr>
@@ -3218,7 +3310,7 @@
       <w:color w:val="ff0000"/>
     </w:rPr>
   </w:style>
-  <w:style w:type="character" w:customStyle="1" w:styleId="NormalTok">
+  <w:style w:customStyle="1" w:styleId="NormalTok" w:type="character">
     <w:name w:val="NormalTok"/>
     <w:basedOn w:val="VerbatimChar"/>
     <w:rPr/>

</xml_diff>

<commit_message>
Redo tracked-doc fix per revision-number rule: R1 frozen, fix in R1.1
Previous commit (ceaa843) violated the projects no-rewrite-in-place
rule by editing _R1_tracked directly. This corrects that: reverted
CHAPTER1/2/3_..._R1_tracked.md/.docx back to their pre-ceaa843
frozen state, and moved the actual fix (color styling that pandoc
was silently dropping, plus resyncing stale content against the
current final chapters) into new _R1.1_tracked.md/.docx files.
_R1_tracked is untouched/frozen going forward.
</commit_message>
<xml_diff>
--- a/claude/thesis_chapter/CHAPTER1_framework_FA_R1_tracked.docx
+++ b/claude/thesis_chapter/CHAPTER1_framework_FA_R1_tracked.docx
@@ -35,7 +35,6 @@
       </w:r>
       <w:r>
         <w:rPr>
-          <w:rStyle w:val="TrackAdd"/>
           <w:rtl/>
         </w:rPr>
         <w:t xml:space="preserve">سبزرنگ</w:t>
@@ -60,7 +59,7 @@
       </w:r>
       <w:r>
         <w:rPr>
-          <w:rStyle w:val="TrackDel"/>
+          <w:strike/>
           <w:rtl/>
         </w:rPr>
         <w:t xml:space="preserve">قرمز خط‌خورده</w:t>
@@ -122,7 +121,7 @@
       </w:r>
       <w:r>
         <w:rPr>
-          <w:rStyle w:val="TrackDel"/>
+          <w:strike/>
           <w:rtl/>
         </w:rPr>
         <w:t xml:space="preserve">جزعی از سازه ویا</w:t>
@@ -135,7 +134,6 @@
       </w:r>
       <w:r>
         <w:rPr>
-          <w:rStyle w:val="TrackAdd"/>
           <w:rtl/>
         </w:rPr>
         <w:t xml:space="preserve">جزئی از یک سازه و یا</w:t>
@@ -154,7 +152,6 @@
       </w:r>
       <w:r>
         <w:rPr>
-          <w:rStyle w:val="TrackAdd"/>
           <w:rtl/>
         </w:rPr>
         <w:t xml:space="preserve">ٔ مستقل</w:t>
@@ -175,11 +172,22 @@
         <w:rPr>
           <w:rtl/>
         </w:rPr>
+        <w:t xml:space="preserve"> </w:t>
+      </w:r>
+      <w:r>
+        <w:rPr>
+          <w:rtl/>
+        </w:rPr>
         <w:t xml:space="preserve">انتقال سیال، فضاپیماها، رآکتورهای</w:t>
       </w:r>
       <w:r>
         <w:rPr>
-          <w:rStyle w:val="TrackAdd"/>
+          <w:rtl/>
+        </w:rPr>
+        <w:t xml:space="preserve"> </w:t>
+      </w:r>
+      <w:r>
+        <w:rPr>
           <w:rtl/>
         </w:rPr>
         <w:t xml:space="preserve">هسته‌ای</w:t>
@@ -204,14 +212,13 @@
       </w:r>
       <w:r>
         <w:rPr>
-          <w:rStyle w:val="TrackDel"/>
+          <w:strike/>
           <w:rtl/>
         </w:rPr>
         <w:t xml:space="preserve">غیره از آن استفاده می‌شود</w:t>
       </w:r>
       <w:r>
         <w:rPr>
-          <w:rStyle w:val="TrackAdd"/>
           <w:rtl/>
         </w:rPr>
         <w:t xml:space="preserve">مانند آن‌ها به‌کار می‌رود</w:t>
@@ -230,14 +237,13 @@
       </w:r>
       <w:r>
         <w:rPr>
-          <w:rStyle w:val="TrackDel"/>
+          <w:strike/>
           <w:rtl/>
         </w:rPr>
         <w:t xml:space="preserve">استفاده</w:t>
       </w:r>
       <w:r>
         <w:rPr>
-          <w:rStyle w:val="TrackAdd"/>
           <w:rtl/>
         </w:rPr>
         <w:t xml:space="preserve">کاربرد</w:t>
@@ -262,7 +268,6 @@
       </w:r>
       <w:r>
         <w:rPr>
-          <w:rStyle w:val="TrackAdd"/>
           <w:rtl/>
         </w:rPr>
         <w:t xml:space="preserve">همواره</w:t>
@@ -271,6 +276,12 @@
         <w:rPr>
           <w:rtl/>
         </w:rPr>
+        <w:t xml:space="preserve"> </w:t>
+      </w:r>
+      <w:r>
+        <w:rPr>
+          <w:rtl/>
+        </w:rPr>
         <w:t xml:space="preserve">مورد توجه و</w:t>
       </w:r>
       <w:r>
@@ -281,7 +292,7 @@
       </w:r>
       <w:r>
         <w:rPr>
-          <w:rStyle w:val="TrackDel"/>
+          <w:strike/>
           <w:rtl/>
         </w:rPr>
         <w:t xml:space="preserve">تحقیق پژوهشگران و</w:t>
@@ -294,7 +305,6 @@
       </w:r>
       <w:r>
         <w:rPr>
-          <w:rStyle w:val="TrackAdd"/>
           <w:rtl/>
         </w:rPr>
         <w:t xml:space="preserve">پژوهش</w:t>
@@ -303,6 +313,12 @@
         <w:rPr>
           <w:rtl/>
         </w:rPr>
+        <w:t xml:space="preserve"> </w:t>
+      </w:r>
+      <w:r>
+        <w:rPr>
+          <w:rtl/>
+        </w:rPr>
         <w:t xml:space="preserve">دانشمندان قرار گرفته‌اند.</w:t>
       </w:r>
     </w:p>
@@ -318,7 +334,6 @@
       </w:r>
       <w:r>
         <w:rPr>
-          <w:rStyle w:val="TrackAdd"/>
           <w:rtl/>
         </w:rPr>
         <w:t xml:space="preserve">،</w:t>
@@ -337,7 +352,6 @@
       </w:r>
       <w:r>
         <w:rPr>
-          <w:rStyle w:val="TrackAdd"/>
           <w:rtl/>
         </w:rPr>
         <w:t xml:space="preserve">ش</w:t>
@@ -350,7 +364,12 @@
       </w:r>
       <w:r>
         <w:rPr>
-          <w:rStyle w:val="TrackAdd"/>
+          <w:rtl/>
+        </w:rPr>
+        <w:t xml:space="preserve"> </w:t>
+      </w:r>
+      <w:r>
+        <w:rPr>
           <w:rtl/>
         </w:rPr>
         <w:t xml:space="preserve">و</w:t>
@@ -369,7 +388,6 @@
       </w:r>
       <w:r>
         <w:rPr>
-          <w:rStyle w:val="TrackAdd"/>
           <w:rtl/>
         </w:rPr>
         <w:t xml:space="preserve">،</w:t>
@@ -384,14 +402,49 @@
         <w:rPr>
           <w:rtl/>
         </w:rPr>
-        <w:t xml:space="preserve">توجه زیادی را به خود جلب کردند</w:t>
-      </w:r>
-      <w:r>
-        <w:rPr>
-          <w:rStyle w:val="TrackAdd"/>
-          <w:rtl/>
-        </w:rPr>
-        <w:t xml:space="preserve">[</w:t>
+        <w:t xml:space="preserve">توجه زیادی را به خود جلب کردند. گرافن</w:t>
+      </w:r>
+      <w:r>
+        <w:rPr>
+          <w:rtl/>
+        </w:rPr>
+        <w:t xml:space="preserve">،</w:t>
+      </w:r>
+      <w:r>
+        <w:rPr>
+          <w:rtl/>
+        </w:rPr>
+        <w:t xml:space="preserve"> </w:t>
+      </w:r>
+      <w:r>
+        <w:rPr>
+          <w:rtl/>
+        </w:rPr>
+        <w:t xml:space="preserve">که یک صفحهٔ تک‌اتمی با آرایش لانه‌زنبوری از اتم‌های کربن با مدول الاستیک فوق‌العاده زیاد، استحکام کششی</w:t>
+      </w:r>
+      <w:r>
+        <w:rPr>
+          <w:rtl/>
+        </w:rPr>
+        <w:t xml:space="preserve"> </w:t>
+      </w:r>
+      <w:r>
+        <w:rPr>
+          <w:rtl/>
+        </w:rPr>
+        <w:t xml:space="preserve">بالا</w:t>
+      </w:r>
+      <w:r>
+        <w:rPr>
+          <w:rtl/>
+        </w:rPr>
+        <w:t xml:space="preserve"> </w:t>
+      </w:r>
+      <w:r>
+        <w:rPr>
+          <w:rtl/>
+        </w:rPr>
+        <w:t xml:space="preserve">و سطح ویژهٔ بسیار بزرگ است، توجه فراوانی را در میان پژوهشگران و صنعتگران برانگیخته است. از زمان کشف گرافن در سال ۲۰۰۴، در بسیاری از مطالعات تجربی گزارش شده است که نانوکامپوزیت‌های تقویت‌شده با گرافن، در مقایسه با کامپوزیت‌های نانولولهٔ کربنی و نانوگرافیت، بهبود قابل‌توجهی در خواص مکانیکی نشان می‌دهند [</w:t>
       </w:r>
       <w:hyperlink w:anchor="Xc1d5c3a48988e3f28b06b0c8cea541618683479">
         <w:r>
@@ -404,79 +457,12 @@
       </w:hyperlink>
       <w:r>
         <w:rPr>
-          <w:rStyle w:val="TrackAdd"/>
-          <w:rtl/>
-        </w:rPr>
-        <w:t xml:space="preserve">]</w:t>
-      </w:r>
-      <w:r>
-        <w:rPr>
-          <w:rtl/>
-        </w:rPr>
-        <w:t xml:space="preserve">. گرافن</w:t>
-      </w:r>
-      <w:r>
-        <w:rPr>
-          <w:rStyle w:val="TrackAdd"/>
-          <w:rtl/>
-        </w:rPr>
-        <w:t xml:space="preserve">،</w:t>
-      </w:r>
-      <w:r>
-        <w:rPr>
-          <w:rtl/>
-        </w:rPr>
-        <w:t xml:space="preserve"> </w:t>
-      </w:r>
-      <w:r>
-        <w:rPr>
-          <w:rtl/>
-        </w:rPr>
-        <w:t xml:space="preserve">که یک صفحهٔ تک‌اتمی با آرایش لانه‌زنبوری از اتم‌های کربن با مدول الاستیک فوق‌العاده زیاد، استحکام کششی</w:t>
-      </w:r>
-      <w:r>
-        <w:rPr>
-          <w:rtl/>
-        </w:rPr>
-        <w:t xml:space="preserve"> </w:t>
-      </w:r>
-      <w:r>
-        <w:rPr>
-          <w:rStyle w:val="TrackAdd"/>
-          <w:rtl/>
-        </w:rPr>
-        <w:t xml:space="preserve">بالا</w:t>
-      </w:r>
-      <w:r>
-        <w:rPr>
-          <w:rtl/>
-        </w:rPr>
-        <w:t xml:space="preserve"> </w:t>
-      </w:r>
-      <w:r>
-        <w:rPr>
-          <w:rtl/>
-        </w:rPr>
-        <w:t xml:space="preserve">و سطح ویژهٔ بسیار بزرگ است، توجه فراوانی را در میان پژوهشگران و صنعتگران برانگیخته است. از زمان کشف گرافن در سال ۲۰۰۴، در بسیاری از مطالعات تجربی گزارش شده است که نانوکامپوزیت‌های تقویت‌شده با گرافن، در مقایسه با کامپوزیت‌های نانولولهٔ کربنی و نانوگرافیت، بهبود قابل‌توجهی در خواص مکانیکی نشان می‌دهند [</w:t>
-      </w:r>
-      <w:hyperlink w:anchor="Xc1d5c3a48988e3f28b06b0c8cea541618683479">
-        <w:r>
-          <w:rPr>
-            <w:rStyle w:val="Hyperlink"/>
-            <w:rtl/>
-          </w:rPr>
-          <w:t xml:space="preserve">1</w:t>
-        </w:r>
-      </w:hyperlink>
-      <w:r>
-        <w:rPr>
           <w:rtl/>
         </w:rPr>
         <w:t xml:space="preserve">]. همچنین سطح تماس زیاد ورقه‌های گرافن با مادهٔ زمینه</w:t>
       </w:r>
       <w:r>
         <w:rPr>
-          <w:rStyle w:val="TrackAdd"/>
           <w:rtl/>
         </w:rPr>
         <w:t xml:space="preserve">،</w:t>
@@ -588,7 +574,12 @@
       </w:r>
       <w:r>
         <w:rPr>
-          <w:rStyle w:val="TrackDel"/>
+          <w:rtl/>
+        </w:rPr>
+        <w:t xml:space="preserve"> </w:t>
+      </w:r>
+      <w:r>
+        <w:rPr>
           <w:rtl/>
         </w:rPr>
         <w:t xml:space="preserve">و همچنین بازدهی بیشتری نیز دارد</w:t>
@@ -612,7 +603,12 @@
       </w:r>
       <w:r>
         <w:rPr>
-          <w:rStyle w:val="TrackAdd"/>
+          <w:rtl/>
+        </w:rPr>
+        <w:t xml:space="preserve"> </w:t>
+      </w:r>
+      <w:r>
+        <w:rPr>
           <w:rtl/>
         </w:rPr>
         <w:t xml:space="preserve">لایه‌ای</w:t>
@@ -650,7 +646,7 @@
       </w:pPr>
       <w:r>
         <w:rPr>
-          <w:rStyle w:val="TrackDel"/>
+          <w:strike/>
           <w:rtl/>
         </w:rPr>
         <w:t xml:space="preserve">در این قسمت مختصری از نظرات و پژوهش‏های مربوط به موضوع یا مسایل و مشکلات حل نشده در این حوزه و همچنین توجه و علاقه جامعه به این موضوع اشاره می‏شود.</w:t>
@@ -662,7 +658,6 @@
       </w:pPr>
       <w:r>
         <w:rPr>
-          <w:rStyle w:val="TrackAdd"/>
           <w:rtl/>
         </w:rPr>
         <w:t xml:space="preserve">نخستین چارچوب نظریِ کوپلینگِ میدان دما و میدان تغییرشکل، ترموالاستیسیتهٔ کلاسیکِ ممزوج بود که در آن معادلهٔ هدایت گرمای فوریه با معادلات کشسانی جفت می‌شود. با وجود کامیابیِ گستردهٔ این چارچوب در تحلیل تنش‌های حرارتیِ حالت‌ماندگار و گذرایِ آرام، یک نقص بنیادی در آن آشکار شد: معادلهٔ هدایت فوریه از نوع سهموی (پارابولیک) است و از آن سرعت انتشار نامحدود برای اغتشاش حرارتی نتیجه می‌شود؛ یعنی هر تغییر دما در یک نقطه، بی‌درنگ در سراسر جسم احساس می‌گردد. این ویژگی به‌ویژه در بارگذاری‌های حرارتیِ بسیار سریع، مانند شوک حرارتی، پالس لیزری و بارهای انفجاری، با واقعیت فیزیکیِ انتشارِ متناهیِ گرما ناسازگار است [</w:t>
@@ -678,7 +673,6 @@
       </w:hyperlink>
       <w:r>
         <w:rPr>
-          <w:rStyle w:val="TrackAdd"/>
           <w:rtl/>
         </w:rPr>
         <w:t xml:space="preserve">].</w:t>
@@ -690,7 +684,6 @@
       </w:pPr>
       <w:r>
         <w:rPr>
-          <w:rStyle w:val="TrackAdd"/>
           <w:rtl/>
         </w:rPr>
         <w:t xml:space="preserve">برای برطرف‌کردن این ناسازگاری، نظریه‌های ترموالاستیسیتهٔ تعمیم‌یافته پیشنهاد شدند که در آن‌ها معادلهٔ هدایت به یک معادلهٔ هذلولوی (هایپربولیک) با سرعتِ موج حرارتیِ متناهی تبدیل می‌شود؛ پدیده‌ای که به «صوت دوم» شناخته می‌شود. نخستین و شناخته‌شده‌ترینِ این نظریه‌ها را لرد و شولمن در سال ۱۹۶۷ ارائه کردند [</w:t>
@@ -706,14 +699,12 @@
       </w:hyperlink>
       <w:r>
         <w:rPr>
-          <w:rStyle w:val="TrackAdd"/>
           <w:rtl/>
         </w:rPr>
         <w:t xml:space="preserve">]. آنان با افزودن یک زمان تخفیفِ واحد</w:t>
       </w:r>
       <w:r>
         <w:rPr>
-          <w:rStyle w:val="TrackAdd"/>
           <w:rtl/>
         </w:rPr>
         <w:t xml:space="preserve"> </w:t>
@@ -734,21 +725,18 @@
       </m:oMath>
       <w:r>
         <w:rPr>
-          <w:rStyle w:val="TrackAdd"/>
-          <w:rtl/>
-        </w:rPr>
-        <w:t xml:space="preserve"> </w:t>
-      </w:r>
-      <w:r>
-        <w:rPr>
-          <w:rStyle w:val="TrackAdd"/>
+          <w:rtl/>
+        </w:rPr>
+        <w:t xml:space="preserve"> </w:t>
+      </w:r>
+      <w:r>
+        <w:rPr>
           <w:rtl/>
         </w:rPr>
         <w:t xml:space="preserve">به شارِ گرما (بر پایهٔ قانون هدایتِ کاتانئو–ورنوت)، هدایت را هذلولوی ساختند؛ به‌گونه‌ای که با میل‌کردن</w:t>
       </w:r>
       <w:r>
         <w:rPr>
-          <w:rStyle w:val="TrackAdd"/>
           <w:rtl/>
         </w:rPr>
         <w:t xml:space="preserve"> </w:t>
@@ -769,14 +757,12 @@
       </m:oMath>
       <w:r>
         <w:rPr>
-          <w:rStyle w:val="TrackAdd"/>
-          <w:rtl/>
-        </w:rPr>
-        <w:t xml:space="preserve"> </w:t>
-      </w:r>
-      <w:r>
-        <w:rPr>
-          <w:rStyle w:val="TrackAdd"/>
+          <w:rtl/>
+        </w:rPr>
+        <w:t xml:space="preserve"> </w:t>
+      </w:r>
+      <w:r>
+        <w:rPr>
           <w:rtl/>
         </w:rPr>
         <w:t xml:space="preserve">به صفر، مدل کلاسیکِ فوریه بازیابی می‌شود. پس از آن، نظریه‌های دیگری همچون گرین–لیندسی (با دو زمان تخفیف) و گرین–نقدی (بر پایهٔ گرادیان دما و نرخ آن، از نوع بدونِ اتلاف انرژی و با اتلاف) و نیز مدل تأخیر دوفازی معرفی شدند؛ مروری جامع بر این نظریه‌ها و مدل‌های اصلاح‌شده را می‌توان یافت [</w:t>
@@ -792,7 +778,6 @@
       </w:hyperlink>
       <w:r>
         <w:rPr>
-          <w:rStyle w:val="TrackAdd"/>
           <w:rtl/>
         </w:rPr>
         <w:t xml:space="preserve">]. در میان این نظریه‌ها، تئوری لرد–شولمن به‌سبب سادگیِ نسبی (تنها یک زمان تخفیف) و سازگاریِ ترمودینامیکی، بیش از دیگر مدل‌ها در تحلیل سازه‌های تحت شوک حرارتی به‌کار رفته است.</w:t>
@@ -804,7 +789,6 @@
       </w:pPr>
       <w:r>
         <w:rPr>
-          <w:rStyle w:val="TrackAdd"/>
           <w:rtl/>
         </w:rPr>
         <w:t xml:space="preserve">هم‌زمان با پیشرفت این نظریه‌ها، تحلیل استوانه‌ها و کره‌های جدارضخیم تحت بارهای حرارتی و مکانیکی نیز به یکی از حوزه‌های پرکاربردِ پژوهش بدل شد. باگری و اسلامی حلی یکپارچه برای ترموالاستیسیتهٔ تعمیم‌یافتهٔ استوانه‌ها و کره‌ها ارائه کردند [</w:t>
@@ -820,7 +804,6 @@
       </w:hyperlink>
       <w:r>
         <w:rPr>
-          <w:rStyle w:val="TrackAdd"/>
           <w:rtl/>
         </w:rPr>
         <w:t xml:space="preserve">]، و مطالعاتِ متعددی پاسخ استوانه‌های مدرج تابعی را تحت بارگذاری ترمومکانیکی بررسی کردند. با پیدایش کامپوزیت‌های تقویت‌شده با پلاکت‌های گرافنی و مواد مرکب متخلخل، توجه پژوهش‌ها به سازه‌های نوینی معطوف شد که در آن‌ها خواص مؤثر در راستای ضخامت به‌صورت هدفمند مدرج می‌شود؛ حیدرپور و همکاران تحلیل ترموالاستیک پوسته‌های کروی و استوانه‌ایِ تقویت‌شده با گرافن را بر پایهٔ تئوری لرد–شولمن و به روش دیفرانسیل کوادریچر توسعه دادند [</w:t>
@@ -836,14 +819,12 @@
       </w:hyperlink>
       <w:r>
         <w:rPr>
-          <w:rStyle w:val="TrackAdd"/>
           <w:rtl/>
         </w:rPr>
         <w:t xml:space="preserve">,</w:t>
       </w:r>
       <w:r>
         <w:rPr>
-          <w:rStyle w:val="TrackAdd"/>
           <w:rtl/>
         </w:rPr>
         <w:t xml:space="preserve"> </w:t>
@@ -859,14 +840,12 @@
       </w:hyperlink>
       <w:r>
         <w:rPr>
-          <w:rStyle w:val="TrackAdd"/>
           <w:rtl/>
         </w:rPr>
         <w:t xml:space="preserve">]. باوجود این پیشینهٔ غنی، حل کاملاً ممزوجِ لرد–شولمن برای یک استوانهٔ توخالیِ چندلایهٔ متخلخل و تقویت‌شده با گرافن، با در نظر گرفتنِ برهم‌کنشِ کاملِ الگوهای توزیع گرافن و تخلخل در فضای دوبعدیِ</w:t>
       </w:r>
       <w:r>
         <w:rPr>
-          <w:rStyle w:val="TrackAdd"/>
           <w:rtl/>
         </w:rPr>
         <w:t xml:space="preserve"> </w:t>
@@ -899,7 +878,6 @@
       </m:oMath>
       <w:r>
         <w:rPr>
-          <w:rStyle w:val="TrackAdd"/>
           <w:rtl/>
         </w:rPr>
         <w:t xml:space="preserve">، هنوز به‌طور کامل بررسی نشده بود؛ همین شکاف، انگیزهٔ اصلی پژوهش حاضر است.</w:t>
@@ -937,14 +915,13 @@
       </w:r>
       <w:r>
         <w:rPr>
-          <w:rStyle w:val="TrackDel"/>
+          <w:strike/>
           <w:rtl/>
         </w:rPr>
         <w:t xml:space="preserve">خواهد شد</w:t>
       </w:r>
       <w:r>
         <w:rPr>
-          <w:rStyle w:val="TrackAdd"/>
           <w:rtl/>
         </w:rPr>
         <w:t xml:space="preserve">می‌شود</w:t>
@@ -963,14 +940,12 @@
       </w:r>
       <w:r>
         <w:rPr>
-          <w:rStyle w:val="TrackAdd"/>
           <w:rtl/>
         </w:rPr>
         <w:t xml:space="preserve">هندسهٔ مورد بررسی یک استوانهٔ توخالیِ جدارضخیمِ چندلایه با شعاع داخلی</w:t>
       </w:r>
       <w:r>
         <w:rPr>
-          <w:rStyle w:val="TrackAdd"/>
           <w:rtl/>
         </w:rPr>
         <w:t xml:space="preserve"> </w:t>
@@ -1009,21 +984,18 @@
       </m:oMath>
       <w:r>
         <w:rPr>
-          <w:rStyle w:val="TrackAdd"/>
-          <w:rtl/>
-        </w:rPr>
-        <w:t xml:space="preserve"> </w:t>
-      </w:r>
-      <w:r>
-        <w:rPr>
-          <w:rStyle w:val="TrackAdd"/>
+          <w:rtl/>
+        </w:rPr>
+        <w:t xml:space="preserve"> </w:t>
+      </w:r>
+      <w:r>
+        <w:rPr>
           <w:rtl/>
         </w:rPr>
         <w:t xml:space="preserve">متر، شعاع خارجی</w:t>
       </w:r>
       <w:r>
         <w:rPr>
-          <w:rStyle w:val="TrackAdd"/>
           <w:rtl/>
         </w:rPr>
         <w:t xml:space="preserve"> </w:t>
@@ -1062,21 +1034,18 @@
       </m:oMath>
       <w:r>
         <w:rPr>
-          <w:rStyle w:val="TrackAdd"/>
-          <w:rtl/>
-        </w:rPr>
-        <w:t xml:space="preserve"> </w:t>
-      </w:r>
-      <w:r>
-        <w:rPr>
-          <w:rStyle w:val="TrackAdd"/>
+          <w:rtl/>
+        </w:rPr>
+        <w:t xml:space="preserve"> </w:t>
+      </w:r>
+      <w:r>
+        <w:rPr>
           <w:rtl/>
         </w:rPr>
         <w:t xml:space="preserve">متر (ضخامت جداره</w:t>
       </w:r>
       <w:r>
         <w:rPr>
-          <w:rStyle w:val="TrackAdd"/>
           <w:rtl/>
         </w:rPr>
         <w:t xml:space="preserve"> </w:t>
@@ -1142,21 +1111,18 @@
       </m:oMath>
       <w:r>
         <w:rPr>
-          <w:rStyle w:val="TrackAdd"/>
-          <w:rtl/>
-        </w:rPr>
-        <w:t xml:space="preserve"> </w:t>
-      </w:r>
-      <w:r>
-        <w:rPr>
-          <w:rStyle w:val="TrackAdd"/>
+          <w:rtl/>
+        </w:rPr>
+        <w:t xml:space="preserve"> </w:t>
+      </w:r>
+      <w:r>
+        <w:rPr>
           <w:rtl/>
         </w:rPr>
         <w:t xml:space="preserve">متر)، طول</w:t>
       </w:r>
       <w:r>
         <w:rPr>
-          <w:rStyle w:val="TrackAdd"/>
           <w:rtl/>
         </w:rPr>
         <w:t xml:space="preserve"> </w:t>
@@ -1186,21 +1152,18 @@
       </m:oMath>
       <w:r>
         <w:rPr>
-          <w:rStyle w:val="TrackAdd"/>
-          <w:rtl/>
-        </w:rPr>
-        <w:t xml:space="preserve"> </w:t>
-      </w:r>
-      <w:r>
-        <w:rPr>
-          <w:rStyle w:val="TrackAdd"/>
+          <w:rtl/>
+        </w:rPr>
+        <w:t xml:space="preserve"> </w:t>
+      </w:r>
+      <w:r>
+        <w:rPr>
           <w:rtl/>
         </w:rPr>
         <w:t xml:space="preserve">متر و</w:t>
       </w:r>
       <w:r>
         <w:rPr>
-          <w:rStyle w:val="TrackAdd"/>
           <w:rtl/>
         </w:rPr>
         <w:t xml:space="preserve"> </w:t>
@@ -1230,14 +1193,12 @@
       </m:oMath>
       <w:r>
         <w:rPr>
-          <w:rStyle w:val="TrackAdd"/>
-          <w:rtl/>
-        </w:rPr>
-        <w:t xml:space="preserve"> </w:t>
-      </w:r>
-      <w:r>
-        <w:rPr>
-          <w:rStyle w:val="TrackAdd"/>
+          <w:rtl/>
+        </w:rPr>
+        <w:t xml:space="preserve"> </w:t>
+      </w:r>
+      <w:r>
+        <w:rPr>
           <w:rtl/>
         </w:rPr>
         <w:t xml:space="preserve">لایه است. خواص مادی در راستای ضخامت به‌صورت لایه‌ای مدرج می‌شود؛ به‌گونه‌ای که هم توزیع پلاکت‌های گرافن و هم توزیع تخلخل می‌توانند از پنج الگوی متفاوت پیروی کنند.</w:t>
@@ -1274,7 +1235,6 @@
       </w:pPr>
       <w:r>
         <w:rPr>
-          <w:rStyle w:val="TrackAdd"/>
           <w:rtl/>
         </w:rPr>
         <w:t xml:space="preserve">پرسش‌های اصلی پژوهش عبارت‌اند از:</w:t>
@@ -1291,7 +1251,6 @@
       </w:pPr>
       <w:r>
         <w:rPr>
-          <w:rStyle w:val="TrackAdd"/>
           <w:rtl/>
         </w:rPr>
         <w:t xml:space="preserve">سرعتِ متناهیِ موج حرارتی در تئوری لرد–شولمن چه تفاوتی در پاسخ دما، تنش و جابجایی نسبت به هدایت کلاسیک فوریه ایجاد می‌کند؟</w:t>
@@ -1308,7 +1267,6 @@
       </w:pPr>
       <w:r>
         <w:rPr>
-          <w:rStyle w:val="TrackAdd"/>
           <w:rtl/>
         </w:rPr>
         <w:t xml:space="preserve">الگوی توزیع پلاکت‌های گرافن و الگو و شدت تخلخل، هر یک چگونه بر بیشینهٔ دما، تنش‌های حرارتی و جابجایی‌ها اثر می‌گذارند؟</w:t>
@@ -1325,7 +1283,6 @@
       </w:pPr>
       <w:r>
         <w:rPr>
-          <w:rStyle w:val="TrackAdd"/>
           <w:rtl/>
         </w:rPr>
         <w:t xml:space="preserve">آیا برهم‌کنشِ هم‌زمانِ الگوهای گرافن و تخلخل می‌تواند رفتار هم‌افزا یا خنثی‌کننده پدید آورد و برای حفاظت حرارتی بهینه شود؟</w:t>
@@ -1342,7 +1299,6 @@
       </w:pPr>
       <w:r>
         <w:rPr>
-          <w:rStyle w:val="TrackAdd"/>
           <w:rtl/>
         </w:rPr>
         <w:t xml:space="preserve">تأثیر پارامترهایی همچون کسر وزنی گرافن، نسبت‌های ابعادی پلاکت، زمان تخفیف، شرایط تکیه‌گاهی، فشار داخلی و ضخامت جداره بر پاسخ گذرا چگونه است؟</w:t>
@@ -1391,14 +1347,13 @@
       </w:r>
       <w:r>
         <w:rPr>
-          <w:rStyle w:val="TrackDel"/>
+          <w:strike/>
           <w:rtl/>
         </w:rPr>
         <w:t xml:space="preserve">در پایان نتیجه گیری اعلام می‌شود</w:t>
       </w:r>
       <w:r>
         <w:rPr>
-          <w:rStyle w:val="TrackAdd"/>
           <w:rtl/>
         </w:rPr>
         <w:t xml:space="preserve">نتیجه‌گیری ارائه می‌گردد</w:t>
@@ -1430,7 +1385,7 @@
       </w:pPr>
       <w:r>
         <w:rPr>
-          <w:rStyle w:val="TrackDel"/>
+          <w:strike/>
           <w:rtl/>
         </w:rPr>
         <w:t xml:space="preserve">با توجه به همانندی این قسمت از طرح پژوهش با تعریف موضوع پژوهش که در آن پژوهشگر نیاز خود را در آگاهی به نتایج مطالعه عنوان می‏سازد، در این قسمت منابع شخصی یا علمی که از خاتمه پژوهش به پژوهشگر دست می‏دهد، بحث می‏شود.</w:t>
@@ -1442,7 +1397,6 @@
       </w:pPr>
       <w:r>
         <w:rPr>
-          <w:rStyle w:val="TrackAdd"/>
           <w:rtl/>
         </w:rPr>
         <w:t xml:space="preserve">استوانه‌های جدارضخیم که در مخازن تحت‌فشار، اجزای رآکتورهای هسته‌ای، سازه‌های هوافضایی و مبدل‌های حرارتی به‌کار می‌روند، اغلب در معرض بارهای حرارتیِ سریع و شدید قرار می‌گیرند. در چنین شرایطی، پیش‌بینیِ دقیقِ میدان دما و تنش‌های حرارتیِ گذرا برای تضمینِ ایمنی و طول عمر سازه حیاتی است. تحلیل کلاسیک بر پایهٔ هدایت فوریه، به‌سببِ فرضِ سرعت نامحدودِ انتشار گرما، بیشینهٔ تنش‌های گذرا را در جبهه‌های موجِ حرارتی به‌شکلی نامحافظه‌کارانه کم‌برآورد می‌کند؛ این کم‌برآوردی در بارگذاری‌های ضربه‌ای می‌تواند بسیار بزرگ باشد. از این‌رو به‌کارگیری تئوری لرد–شولمن، که سرعتِ متناهیِ موج حرارتی را لحاظ می‌کند، برای طراحی ایمنِ چنین اجزایی اهمیت مهندسی مستقیم دارد.</w:t>
@@ -1454,7 +1408,6 @@
       </w:pPr>
       <w:r>
         <w:rPr>
-          <w:rStyle w:val="TrackAdd"/>
           <w:rtl/>
         </w:rPr>
         <w:t xml:space="preserve">افزون بر این، ترکیبِ گرافن (به‌عنوان تقویت‌کنندهٔ رسانا و پُراستحکام) با تخلخل (به‌عنوان عاملِ سبک‌سازی و عایق‌سازیِ حرارتی) در یک مادهٔ مدرجِ لایه‌ای، این امکان را فراهم می‌آورد که با هم‌راستا کردنِ الگوهای توزیع، به‌طور هم‌زمان وزن سازه کاهش یابد و مقاومت حرارتی و مکانیکی آن بهبود پذیرد. شناختِ چگونگیِ اثرگذاریِ این الگوها و برهم‌کنشِ آن‌ها، به طراح اجازه می‌دهد توزیعِ ماده را متناسب با شرایط بارگذاری بهینه کند. بدین‌ترتیب، نتایج این پژوهش هم از منظر علمی، در روشن‌ساختنِ سرشتِ موجیِ هدایت گرما در سازه‌های نوین، و هم از منظر کاربردی، در ارائهٔ توصیه‌های طراحی برای حفاظت حرارتی، سودمند است.</w:t>
@@ -1480,7 +1433,7 @@
       </w:pPr>
       <w:r>
         <w:rPr>
-          <w:rStyle w:val="TrackDel"/>
+          <w:strike/>
           <w:rtl/>
         </w:rPr>
         <w:t xml:space="preserve">محدودیت‏هایی که کنترل آن از عهده پژوهشگر خارج است مانند انتخاب نوع یافته‏ها و دیگر محدودیت‏هایی که کنترل آن در دست پژوهشگر است مانند موضوع و محل پژوهش</w:t>
@@ -1492,7 +1445,6 @@
       </w:pPr>
       <w:r>
         <w:rPr>
-          <w:rStyle w:val="TrackAdd"/>
           <w:rtl/>
         </w:rPr>
         <w:t xml:space="preserve">در این پژوهش، برای امکان‌پذیر ساختنِ تحلیل و تمرکز بر پدیده‌های اصلی، فرض‌ها و محدودیت‌های زیر در نظر گرفته شده است:</w:t>
@@ -1509,7 +1461,6 @@
       </w:pPr>
       <w:r>
         <w:rPr>
-          <w:rStyle w:val="TrackAdd"/>
           <w:b/>
           <w:bCs/>
           <w:rtl/>
@@ -1518,14 +1469,12 @@
       </w:r>
       <w:r>
         <w:rPr>
-          <w:rStyle w:val="TrackAdd"/>
-          <w:rtl/>
-        </w:rPr>
-        <w:t xml:space="preserve"> </w:t>
-      </w:r>
-      <w:r>
-        <w:rPr>
-          <w:rStyle w:val="TrackAdd"/>
+          <w:rtl/>
+        </w:rPr>
+        <w:t xml:space="preserve"> </w:t>
+      </w:r>
+      <w:r>
+        <w:rPr>
           <w:rtl/>
         </w:rPr>
         <w:t xml:space="preserve">رفتار ماده کاملاً کشسانِ خطی فرض شده و از مدل‌های آسیب، شکست و پلاستیسیته صرف‌نظر شده است؛ بنابراین حل حاضر پیش‌بینیِ گسست یا جدایشِ ماده را در بارهای بسیار زیاد در بر نمی‌گیرد.</w:t>
@@ -1542,7 +1491,6 @@
       </w:pPr>
       <w:r>
         <w:rPr>
-          <w:rStyle w:val="TrackAdd"/>
           <w:b/>
           <w:bCs/>
           <w:rtl/>
@@ -1551,14 +1499,12 @@
       </w:r>
       <w:r>
         <w:rPr>
-          <w:rStyle w:val="TrackAdd"/>
-          <w:rtl/>
-        </w:rPr>
-        <w:t xml:space="preserve"> </w:t>
-      </w:r>
-      <w:r>
-        <w:rPr>
-          <w:rStyle w:val="TrackAdd"/>
+          <w:rtl/>
+        </w:rPr>
+        <w:t xml:space="preserve"> </w:t>
+      </w:r>
+      <w:r>
+        <w:rPr>
           <w:rtl/>
         </w:rPr>
         <w:t xml:space="preserve">خواص مادی (مدول یانگ، هدایت حرارتی و ضریب انبساط) در بازهٔ دماییِ ۳۰۰ تا ۶۰۰ کلوین ثابت و مستقل از دما فرض شده‌اند، درحالی‌که این خواص در این بازه می‌توانند تغییر کنند.</w:t>
@@ -1575,7 +1521,6 @@
       </w:pPr>
       <w:r>
         <w:rPr>
-          <w:rStyle w:val="TrackAdd"/>
           <w:b/>
           <w:bCs/>
           <w:rtl/>
@@ -1584,14 +1529,12 @@
       </w:r>
       <w:r>
         <w:rPr>
-          <w:rStyle w:val="TrackAdd"/>
-          <w:rtl/>
-        </w:rPr>
-        <w:t xml:space="preserve"> </w:t>
-      </w:r>
-      <w:r>
-        <w:rPr>
-          <w:rStyle w:val="TrackAdd"/>
+          <w:rtl/>
+        </w:rPr>
+        <w:t xml:space="preserve"> </w:t>
+      </w:r>
+      <w:r>
+        <w:rPr>
           <w:rtl/>
         </w:rPr>
         <w:t xml:space="preserve">دو سرِ استوانه عایق حرارتی فرض شده و تبادل حرارت با محیط تنها از راه همرفتِ خطی در سطح خارجی لحاظ شده است؛ از تبادل حرارتِ تابشیِ غیرخطی صرف‌نظر شده است.</w:t>
@@ -1608,7 +1551,6 @@
       </w:pPr>
       <w:r>
         <w:rPr>
-          <w:rStyle w:val="TrackAdd"/>
           <w:b/>
           <w:bCs/>
           <w:rtl/>
@@ -1617,21 +1559,18 @@
       </w:r>
       <w:r>
         <w:rPr>
-          <w:rStyle w:val="TrackAdd"/>
-          <w:rtl/>
-        </w:rPr>
-        <w:t xml:space="preserve"> </w:t>
-      </w:r>
-      <w:r>
-        <w:rPr>
-          <w:rStyle w:val="TrackAdd"/>
+          <w:rtl/>
+        </w:rPr>
+        <w:t xml:space="preserve"> </w:t>
+      </w:r>
+      <w:r>
+        <w:rPr>
           <w:rtl/>
         </w:rPr>
         <w:t xml:space="preserve">مسئله متقارن محوری در نظر گرفته شده و وابستگی میدان‌ها به مختصهٔ محیطی</w:t>
       </w:r>
       <w:r>
         <w:rPr>
-          <w:rStyle w:val="TrackAdd"/>
           <w:rtl/>
         </w:rPr>
         <w:t xml:space="preserve"> </w:t>
@@ -1643,14 +1582,12 @@
       </m:oMath>
       <w:r>
         <w:rPr>
-          <w:rStyle w:val="TrackAdd"/>
-          <w:rtl/>
-        </w:rPr>
-        <w:t xml:space="preserve"> </w:t>
-      </w:r>
-      <w:r>
-        <w:rPr>
-          <w:rStyle w:val="TrackAdd"/>
+          <w:rtl/>
+        </w:rPr>
+        <w:t xml:space="preserve"> </w:t>
+      </w:r>
+      <w:r>
+        <w:rPr>
           <w:rtl/>
         </w:rPr>
         <w:t xml:space="preserve">حذف شده است؛ استوانه ساکن (غیردوّار) فرض می‌شود.</w:t>
@@ -1667,7 +1604,6 @@
       </w:pPr>
       <w:r>
         <w:rPr>
-          <w:rStyle w:val="TrackAdd"/>
           <w:b/>
           <w:bCs/>
           <w:rtl/>
@@ -1676,14 +1612,12 @@
       </w:r>
       <w:r>
         <w:rPr>
-          <w:rStyle w:val="TrackAdd"/>
-          <w:rtl/>
-        </w:rPr>
-        <w:t xml:space="preserve"> </w:t>
-      </w:r>
-      <w:r>
-        <w:rPr>
-          <w:rStyle w:val="TrackAdd"/>
+          <w:rtl/>
+        </w:rPr>
+        <w:t xml:space="preserve"> </w:t>
+      </w:r>
+      <w:r>
+        <w:rPr>
           <w:rtl/>
         </w:rPr>
         <w:t xml:space="preserve">الگوهای توزیع تخلخلِ به‌کاررفته، همان الگوهای پیاده‌سازی‌شده در حل‌گر هستند؛ به‌روزرسانیِ این الگوها با الگوهای جدید و بازاجرای مطالعاتِ مربوط، به پژوهش‌های آینده موکول شده است.</w:t>
@@ -1829,7 +1763,12 @@
       </w:r>
       <w:r>
         <w:rPr>
-          <w:rStyle w:val="TrackAdd"/>
+          <w:rtl/>
+        </w:rPr>
+        <w:t xml:space="preserve"> </w:t>
+      </w:r>
+      <w:r>
+        <w:rPr>
           <w:rtl/>
         </w:rPr>
         <w:t xml:space="preserve">و در آن با معرفیِ زمان تخفیف، سرعتِ انتشار موج حرارتی متناهی می‌شود</w:t>
@@ -1860,7 +1799,7 @@
       </w:pPr>
       <w:r>
         <w:rPr>
-          <w:rStyle w:val="TrackDel"/>
+          <w:strike/>
           <w:rtl/>
         </w:rPr>
         <w:t xml:space="preserve">متن عادی پایان‏نامه</w:t>
@@ -1872,7 +1811,6 @@
       </w:pPr>
       <w:r>
         <w:rPr>
-          <w:rStyle w:val="TrackAdd"/>
           <w:rtl/>
         </w:rPr>
         <w:t xml:space="preserve">این پایان‌نامه در پنج فصل سازمان‌دهی شده است:</w:t>
@@ -1889,7 +1827,6 @@
       </w:pPr>
       <w:r>
         <w:rPr>
-          <w:rStyle w:val="TrackAdd"/>
           <w:b/>
           <w:bCs/>
           <w:rtl/>
@@ -1898,14 +1835,12 @@
       </w:r>
       <w:r>
         <w:rPr>
-          <w:rStyle w:val="TrackAdd"/>
-          <w:rtl/>
-        </w:rPr>
-        <w:t xml:space="preserve"> </w:t>
-      </w:r>
-      <w:r>
-        <w:rPr>
-          <w:rStyle w:val="TrackAdd"/>
+          <w:rtl/>
+        </w:rPr>
+        <w:t xml:space="preserve"> </w:t>
+      </w:r>
+      <w:r>
+        <w:rPr>
           <w:rtl/>
         </w:rPr>
         <w:t xml:space="preserve">بیان مسئله و اهمیت مهندسیِ آن، انگیزه و کاربردهای واقعی، ضرورتِ به‌کارگیریِ تئوری لرد–شولمن به‌جای هدایت کلاسیک فوریه، هدف‌ها و پرسش‌های پژوهش، دامنه و فرض‌ها، و ساختار پایان‌نامه معرفی می‌شوند.</w:t>
@@ -1922,7 +1857,6 @@
       </w:pPr>
       <w:r>
         <w:rPr>
-          <w:rStyle w:val="TrackAdd"/>
           <w:b/>
           <w:bCs/>
           <w:rtl/>
@@ -1931,14 +1865,12 @@
       </w:r>
       <w:r>
         <w:rPr>
-          <w:rStyle w:val="TrackAdd"/>
-          <w:rtl/>
-        </w:rPr>
-        <w:t xml:space="preserve"> </w:t>
-      </w:r>
-      <w:r>
-        <w:rPr>
-          <w:rStyle w:val="TrackAdd"/>
+          <w:rtl/>
+        </w:rPr>
+        <w:t xml:space="preserve"> </w:t>
+      </w:r>
+      <w:r>
+        <w:rPr>
           <w:rtl/>
         </w:rPr>
         <w:t xml:space="preserve">مروری نظام‌مند بر ادبیات موضوع ارائه می‌شود؛ شامل تئوری‌های به‌کاررفته در تحلیل استوانه‌ها، پژوهش‌های مربوط به استوانه‌ها، مخروط‌ها، کره‌ها و دیسک‌های کامپوزیتی، استوانه‌ها تحت بار ترمو-مکانیکی، مواد مرکب متخلخل، و تئوری‌های ترموالاستیکِ تعمیم‌یافته و ممزوج؛ و در پایان، شکاف پژوهشی که این پایان‌نامه به آن می‌پردازد مشخص می‌شود.</w:t>
@@ -1955,7 +1887,6 @@
       </w:pPr>
       <w:r>
         <w:rPr>
-          <w:rStyle w:val="TrackAdd"/>
           <w:b/>
           <w:bCs/>
           <w:rtl/>
@@ -1964,14 +1895,12 @@
       </w:r>
       <w:r>
         <w:rPr>
-          <w:rStyle w:val="TrackAdd"/>
-          <w:rtl/>
-        </w:rPr>
-        <w:t xml:space="preserve"> </w:t>
-      </w:r>
-      <w:r>
-        <w:rPr>
-          <w:rStyle w:val="TrackAdd"/>
+          <w:rtl/>
+        </w:rPr>
+        <w:t xml:space="preserve"> </w:t>
+      </w:r>
+      <w:r>
+        <w:rPr>
           <w:rtl/>
         </w:rPr>
         <w:t xml:space="preserve">خواص مؤثر مادهٔ تقویت‌شده با گرافن و متخلخل (به روش هالپین–تسای، قانون مخلوط‌ها و تئوری سلول‌های باز) و الگوهای توزیع گرافن و تخلخل استخراج می‌شوند؛ سپس روابط کرنش-جابجایی، تنش-کرنش، معادلات حرکت و معادلهٔ بقای انرژی لرد–شولمن، به‌همراه شرایط مرزی، اولیه و سازگاریِ مکانیکی و حرارتی به‌دست می‌آیند. در ادامه، گسسته‌سازی به روش دیفرانسیل کوادریچر و حلِ سیستمِ مونتاژشده به روش نیومارک تشریح می‌شود.</w:t>
@@ -1988,7 +1917,6 @@
       </w:pPr>
       <w:r>
         <w:rPr>
-          <w:rStyle w:val="TrackAdd"/>
           <w:b/>
           <w:bCs/>
           <w:rtl/>
@@ -1997,14 +1925,12 @@
       </w:r>
       <w:r>
         <w:rPr>
-          <w:rStyle w:val="TrackAdd"/>
-          <w:rtl/>
-        </w:rPr>
-        <w:t xml:space="preserve"> </w:t>
-      </w:r>
-      <w:r>
-        <w:rPr>
-          <w:rStyle w:val="TrackAdd"/>
+          <w:rtl/>
+        </w:rPr>
+        <w:t xml:space="preserve"> </w:t>
+      </w:r>
+      <w:r>
+        <w:rPr>
           <w:rtl/>
         </w:rPr>
         <w:t xml:space="preserve">پس از معرفیِ مسئلهٔ مرجع و کمیت‌های بی‌بعد، همگرایی و صحت‌سنجیِ حل‌گر اثبات می‌شود؛ سپس مطالعات پارامتریِ گسترده (الگوی گرافن و تخلخل، کسر وزنی، نسبت‌های ابعادی، زمان تخفیف، شرایط تکیه‌گاهی، فشار، طول و ضخامت جداره، ممزوج‌بودن معادلات و شوک حرارتی گاوسی) و سه مطالعهٔ گسترشیِ روش‌شناختی گزارش می‌شوند.</w:t>
@@ -2021,7 +1947,6 @@
       </w:pPr>
       <w:r>
         <w:rPr>
-          <w:rStyle w:val="TrackAdd"/>
           <w:b/>
           <w:bCs/>
           <w:rtl/>
@@ -2030,14 +1955,12 @@
       </w:r>
       <w:r>
         <w:rPr>
-          <w:rStyle w:val="TrackAdd"/>
-          <w:rtl/>
-        </w:rPr>
-        <w:t xml:space="preserve"> </w:t>
-      </w:r>
-      <w:r>
-        <w:rPr>
-          <w:rStyle w:val="TrackAdd"/>
+          <w:rtl/>
+        </w:rPr>
+        <w:t xml:space="preserve"> </w:t>
+      </w:r>
+      <w:r>
+        <w:rPr>
           <w:rtl/>
         </w:rPr>
         <w:t xml:space="preserve">مهم‌ترین یافته‌ها، نوآوری‌ها، محدودیت‌ها و پیشنهادها برای پژوهش‌های آینده جمع‌بندی می‌شوند.</w:t>
@@ -2049,7 +1972,7 @@
       </w:pPr>
       <w:r>
         <w:rPr>
-          <w:rStyle w:val="TrackDel"/>
+          <w:strike/>
           <w:rtl/>
         </w:rPr>
         <w:t xml:space="preserve">### عنوان بخش سوم</w:t>
@@ -2061,7 +1984,7 @@
       </w:pPr>
       <w:r>
         <w:rPr>
-          <w:rStyle w:val="TrackDel"/>
+          <w:strike/>
           <w:rtl/>
         </w:rPr>
         <w:t xml:space="preserve">متن عادی پایان‏نامه</w:t>
@@ -3066,22 +2989,7 @@
       <w:color w:themeColor="accent1" w:themeShade="BF" w:val="365F91"/>
     </w:rPr>
   </w:style>
-  <w:style w:customStyle="1" w:styleId="TrackAdd" w:type="character">
-    <w:name w:val="TrackAdd"/>
-    <w:basedOn w:val="BodyTextChar"/>
-    <w:rPr>
-      <w:color w:val="137333"/>
-    </w:rPr>
-  </w:style>
-  <w:style w:customStyle="1" w:styleId="TrackDel" w:type="character">
-    <w:name w:val="TrackDel"/>
-    <w:basedOn w:val="BodyTextChar"/>
-    <w:rPr>
-      <w:color w:val="C5221F"/>
-      <w:strike/>
-    </w:rPr>
-  </w:style>
-  <w:style w:customStyle="1" w:styleId="SourceCode" w:type="paragraph">
+  <w:style w:type="paragraph" w:customStyle="1" w:styleId="SourceCode">
     <w:name w:val="Source Code"/>
     <w:basedOn w:val="Normal"/>
     <w:link w:val="VerbatimChar"/>
@@ -3089,7 +2997,7 @@
       <w:wordWrap w:val="off"/>
     </w:pPr>
   </w:style>
-  <w:style w:customStyle="1" w:styleId="KeywordTok" w:type="character">
+  <w:style w:type="character" w:customStyle="1" w:styleId="KeywordTok">
     <w:name w:val="KeywordTok"/>
     <w:basedOn w:val="VerbatimChar"/>
     <w:rPr>
@@ -3097,77 +3005,77 @@
       <w:color w:val="007020"/>
     </w:rPr>
   </w:style>
-  <w:style w:customStyle="1" w:styleId="DataTypeTok" w:type="character">
+  <w:style w:type="character" w:customStyle="1" w:styleId="DataTypeTok">
     <w:name w:val="DataTypeTok"/>
     <w:basedOn w:val="VerbatimChar"/>
     <w:rPr>
       <w:color w:val="902000"/>
     </w:rPr>
   </w:style>
-  <w:style w:customStyle="1" w:styleId="DecValTok" w:type="character">
+  <w:style w:type="character" w:customStyle="1" w:styleId="DecValTok">
     <w:name w:val="DecValTok"/>
     <w:basedOn w:val="VerbatimChar"/>
     <w:rPr>
       <w:color w:val="40a070"/>
     </w:rPr>
   </w:style>
-  <w:style w:customStyle="1" w:styleId="BaseNTok" w:type="character">
+  <w:style w:type="character" w:customStyle="1" w:styleId="BaseNTok">
     <w:name w:val="BaseNTok"/>
     <w:basedOn w:val="VerbatimChar"/>
     <w:rPr>
       <w:color w:val="40a070"/>
     </w:rPr>
   </w:style>
-  <w:style w:customStyle="1" w:styleId="FloatTok" w:type="character">
+  <w:style w:type="character" w:customStyle="1" w:styleId="FloatTok">
     <w:name w:val="FloatTok"/>
     <w:basedOn w:val="VerbatimChar"/>
     <w:rPr>
       <w:color w:val="40a070"/>
     </w:rPr>
   </w:style>
-  <w:style w:customStyle="1" w:styleId="ConstantTok" w:type="character">
+  <w:style w:type="character" w:customStyle="1" w:styleId="ConstantTok">
     <w:name w:val="ConstantTok"/>
     <w:basedOn w:val="VerbatimChar"/>
     <w:rPr>
       <w:color w:val="880000"/>
     </w:rPr>
   </w:style>
-  <w:style w:customStyle="1" w:styleId="CharTok" w:type="character">
+  <w:style w:type="character" w:customStyle="1" w:styleId="CharTok">
     <w:name w:val="CharTok"/>
     <w:basedOn w:val="VerbatimChar"/>
     <w:rPr>
       <w:color w:val="4070a0"/>
     </w:rPr>
   </w:style>
-  <w:style w:customStyle="1" w:styleId="SpecialCharTok" w:type="character">
+  <w:style w:type="character" w:customStyle="1" w:styleId="SpecialCharTok">
     <w:name w:val="SpecialCharTok"/>
     <w:basedOn w:val="VerbatimChar"/>
     <w:rPr>
       <w:color w:val="4070a0"/>
     </w:rPr>
   </w:style>
-  <w:style w:customStyle="1" w:styleId="StringTok" w:type="character">
+  <w:style w:type="character" w:customStyle="1" w:styleId="StringTok">
     <w:name w:val="StringTok"/>
     <w:basedOn w:val="VerbatimChar"/>
     <w:rPr>
       <w:color w:val="4070a0"/>
     </w:rPr>
   </w:style>
-  <w:style w:customStyle="1" w:styleId="VerbatimStringTok" w:type="character">
+  <w:style w:type="character" w:customStyle="1" w:styleId="VerbatimStringTok">
     <w:name w:val="VerbatimStringTok"/>
     <w:basedOn w:val="VerbatimChar"/>
     <w:rPr>
       <w:color w:val="4070a0"/>
     </w:rPr>
   </w:style>
-  <w:style w:customStyle="1" w:styleId="SpecialStringTok" w:type="character">
+  <w:style w:type="character" w:customStyle="1" w:styleId="SpecialStringTok">
     <w:name w:val="SpecialStringTok"/>
     <w:basedOn w:val="VerbatimChar"/>
     <w:rPr>
       <w:color w:val="bb6688"/>
     </w:rPr>
   </w:style>
-  <w:style w:customStyle="1" w:styleId="ImportTok" w:type="character">
+  <w:style w:type="character" w:customStyle="1" w:styleId="ImportTok">
     <w:name w:val="ImportTok"/>
     <w:basedOn w:val="VerbatimChar"/>
     <w:rPr>
@@ -3175,7 +3083,7 @@
       <w:color w:val="008000"/>
     </w:rPr>
   </w:style>
-  <w:style w:customStyle="1" w:styleId="CommentTok" w:type="character">
+  <w:style w:type="character" w:customStyle="1" w:styleId="CommentTok">
     <w:name w:val="CommentTok"/>
     <w:basedOn w:val="VerbatimChar"/>
     <w:rPr>
@@ -3183,7 +3091,7 @@
       <w:color w:val="60a0b0"/>
     </w:rPr>
   </w:style>
-  <w:style w:customStyle="1" w:styleId="DocumentationTok" w:type="character">
+  <w:style w:type="character" w:customStyle="1" w:styleId="DocumentationTok">
     <w:name w:val="DocumentationTok"/>
     <w:basedOn w:val="VerbatimChar"/>
     <w:rPr>
@@ -3191,7 +3099,7 @@
       <w:color w:val="ba2121"/>
     </w:rPr>
   </w:style>
-  <w:style w:customStyle="1" w:styleId="AnnotationTok" w:type="character">
+  <w:style w:type="character" w:customStyle="1" w:styleId="AnnotationTok">
     <w:name w:val="AnnotationTok"/>
     <w:basedOn w:val="VerbatimChar"/>
     <w:rPr>
@@ -3200,7 +3108,7 @@
       <w:color w:val="60a0b0"/>
     </w:rPr>
   </w:style>
-  <w:style w:customStyle="1" w:styleId="CommentVarTok" w:type="character">
+  <w:style w:type="character" w:customStyle="1" w:styleId="CommentVarTok">
     <w:name w:val="CommentVarTok"/>
     <w:basedOn w:val="VerbatimChar"/>
     <w:rPr>
@@ -3209,28 +3117,28 @@
       <w:color w:val="60a0b0"/>
     </w:rPr>
   </w:style>
-  <w:style w:customStyle="1" w:styleId="OtherTok" w:type="character">
+  <w:style w:type="character" w:customStyle="1" w:styleId="OtherTok">
     <w:name w:val="OtherTok"/>
     <w:basedOn w:val="VerbatimChar"/>
     <w:rPr>
       <w:color w:val="007020"/>
     </w:rPr>
   </w:style>
-  <w:style w:customStyle="1" w:styleId="FunctionTok" w:type="character">
+  <w:style w:type="character" w:customStyle="1" w:styleId="FunctionTok">
     <w:name w:val="FunctionTok"/>
     <w:basedOn w:val="VerbatimChar"/>
     <w:rPr>
       <w:color w:val="06287e"/>
     </w:rPr>
   </w:style>
-  <w:style w:customStyle="1" w:styleId="VariableTok" w:type="character">
+  <w:style w:type="character" w:customStyle="1" w:styleId="VariableTok">
     <w:name w:val="VariableTok"/>
     <w:basedOn w:val="VerbatimChar"/>
     <w:rPr>
       <w:color w:val="19177c"/>
     </w:rPr>
   </w:style>
-  <w:style w:customStyle="1" w:styleId="ControlFlowTok" w:type="character">
+  <w:style w:type="character" w:customStyle="1" w:styleId="ControlFlowTok">
     <w:name w:val="ControlFlowTok"/>
     <w:basedOn w:val="VerbatimChar"/>
     <w:rPr>
@@ -3238,45 +3146,45 @@
       <w:color w:val="007020"/>
     </w:rPr>
   </w:style>
-  <w:style w:customStyle="1" w:styleId="OperatorTok" w:type="character">
+  <w:style w:type="character" w:customStyle="1" w:styleId="OperatorTok">
     <w:name w:val="OperatorTok"/>
     <w:basedOn w:val="VerbatimChar"/>
     <w:rPr>
       <w:color w:val="666666"/>
     </w:rPr>
   </w:style>
-  <w:style w:customStyle="1" w:styleId="BuiltInTok" w:type="character">
+  <w:style w:type="character" w:customStyle="1" w:styleId="BuiltInTok">
     <w:name w:val="BuiltInTok"/>
     <w:basedOn w:val="VerbatimChar"/>
     <w:rPr>
       <w:color w:val="008000"/>
     </w:rPr>
   </w:style>
-  <w:style w:customStyle="1" w:styleId="ExtensionTok" w:type="character">
+  <w:style w:type="character" w:customStyle="1" w:styleId="ExtensionTok">
     <w:name w:val="ExtensionTok"/>
     <w:basedOn w:val="VerbatimChar"/>
     <w:rPr/>
   </w:style>
-  <w:style w:customStyle="1" w:styleId="PreprocessorTok" w:type="character">
+  <w:style w:type="character" w:customStyle="1" w:styleId="PreprocessorTok">
     <w:name w:val="PreprocessorTok"/>
     <w:basedOn w:val="VerbatimChar"/>
     <w:rPr>
       <w:color w:val="bc7a00"/>
     </w:rPr>
   </w:style>
-  <w:style w:customStyle="1" w:styleId="AttributeTok" w:type="character">
+  <w:style w:type="character" w:customStyle="1" w:styleId="AttributeTok">
     <w:name w:val="AttributeTok"/>
     <w:basedOn w:val="VerbatimChar"/>
     <w:rPr>
       <w:color w:val="7d9029"/>
     </w:rPr>
   </w:style>
-  <w:style w:customStyle="1" w:styleId="RegionMarkerTok" w:type="character">
+  <w:style w:type="character" w:customStyle="1" w:styleId="RegionMarkerTok">
     <w:name w:val="RegionMarkerTok"/>
     <w:basedOn w:val="VerbatimChar"/>
     <w:rPr/>
   </w:style>
-  <w:style w:customStyle="1" w:styleId="InformationTok" w:type="character">
+  <w:style w:type="character" w:customStyle="1" w:styleId="InformationTok">
     <w:name w:val="InformationTok"/>
     <w:basedOn w:val="VerbatimChar"/>
     <w:rPr>
@@ -3285,7 +3193,7 @@
       <w:color w:val="60a0b0"/>
     </w:rPr>
   </w:style>
-  <w:style w:customStyle="1" w:styleId="WarningTok" w:type="character">
+  <w:style w:type="character" w:customStyle="1" w:styleId="WarningTok">
     <w:name w:val="WarningTok"/>
     <w:basedOn w:val="VerbatimChar"/>
     <w:rPr>
@@ -3294,7 +3202,7 @@
       <w:color w:val="60a0b0"/>
     </w:rPr>
   </w:style>
-  <w:style w:customStyle="1" w:styleId="AlertTok" w:type="character">
+  <w:style w:type="character" w:customStyle="1" w:styleId="AlertTok">
     <w:name w:val="AlertTok"/>
     <w:basedOn w:val="VerbatimChar"/>
     <w:rPr>
@@ -3302,7 +3210,7 @@
       <w:color w:val="ff0000"/>
     </w:rPr>
   </w:style>
-  <w:style w:customStyle="1" w:styleId="ErrorTok" w:type="character">
+  <w:style w:type="character" w:customStyle="1" w:styleId="ErrorTok">
     <w:name w:val="ErrorTok"/>
     <w:basedOn w:val="VerbatimChar"/>
     <w:rPr>
@@ -3310,7 +3218,7 @@
       <w:color w:val="ff0000"/>
     </w:rPr>
   </w:style>
-  <w:style w:customStyle="1" w:styleId="NormalTok" w:type="character">
+  <w:style w:type="character" w:customStyle="1" w:styleId="NormalTok">
     <w:name w:val="NormalTok"/>
     <w:basedOn w:val="VerbatimChar"/>
     <w:rPr/>

</xml_diff>